<commit_message>
Update Week 7 report to follow the Week 6 enhancement plan
Forms 1 and 2 now carry the Week 6 Form 6 items, owners and Form 4
recommendations, with the two High-priority enhancements implemented this
week. Test counts, integration results (23/23) and evidence refreshed.

Co-Authored-By: Claude Opus 5.5 <noreply@anthropic.com>
Claude-Session: https://claude.ai/code/session_01CETMKsunRcUtvQ9fqodowX
</commit_message>
<xml_diff>
--- a/docs/week7/LSIAMS_Week7_System_Enhancement_and_Testing.docx
+++ b/docs/week7/LSIAMS_Week7_System_Enhancement_and_Testing.docx
@@ -773,10 +773,10 @@
         <w:tblLook w:val="04A0" w:firstRow="1" w:lastRow="0" w:firstColumn="1" w:lastColumn="0" w:noHBand="0" w:noVBand="1"/>
       </w:tblPr>
       <w:tblGrid>
-        <w:gridCol w:w="4867"/>
-        <w:gridCol w:w="1029"/>
-        <w:gridCol w:w="2152"/>
-        <w:gridCol w:w="1310"/>
+        <w:gridCol w:w="4443"/>
+        <w:gridCol w:w="945"/>
+        <w:gridCol w:w="2174"/>
+        <w:gridCol w:w="1796"/>
       </w:tblGrid>
       <w:tr>
         <w:trPr>
@@ -786,7 +786,7 @@
         </w:trPr>
         <w:tc>
           <w:tcPr>
-            <w:tcW w:w="4867" w:type="dxa"/>
+            <w:tcW w:w="4443" w:type="dxa"/>
             <w:shd w:val="clear" w:color="auto" w:fill="D9E2F3"/>
             <w:vAlign w:val="top"/>
             <w:hideMark/>
@@ -813,7 +813,7 @@
         </w:tc>
         <w:tc>
           <w:tcPr>
-            <w:tcW w:w="1029" w:type="dxa"/>
+            <w:tcW w:w="945" w:type="dxa"/>
             <w:shd w:val="clear" w:color="auto" w:fill="D9E2F3"/>
             <w:vAlign w:val="top"/>
             <w:hideMark/>
@@ -840,7 +840,7 @@
         </w:tc>
         <w:tc>
           <w:tcPr>
-            <w:tcW w:w="2152" w:type="dxa"/>
+            <w:tcW w:w="2174" w:type="dxa"/>
             <w:shd w:val="clear" w:color="auto" w:fill="D9E2F3"/>
             <w:vAlign w:val="top"/>
             <w:hideMark/>
@@ -867,7 +867,7 @@
         </w:tc>
         <w:tc>
           <w:tcPr>
-            <w:tcW w:w="1310" w:type="dxa"/>
+            <w:tcW w:w="1796" w:type="dxa"/>
             <w:shd w:val="clear" w:color="auto" w:fill="D9E2F3"/>
             <w:vAlign w:val="top"/>
             <w:hideMark/>
@@ -899,7 +899,7 @@
         </w:trPr>
         <w:tc>
           <w:tcPr>
-            <w:tcW w:w="4867" w:type="dxa"/>
+            <w:tcW w:w="4443" w:type="dxa"/>
             <w:vAlign w:val="top"/>
             <w:hideMark/>
           </w:tcPr>
@@ -920,13 +920,13 @@
                 <w:sz w:val="18"/>
                 <w:szCs w:val="18"/>
               </w:rPr>
-              <w:t xml:space="preserve">E1. Visible accept/refuse feedback on the classroom terminal (status light: 2 blinks accepted, 5 blinks refused)</w:t>
-            </w:r>
-          </w:p>
-        </w:tc>
-        <w:tc>
-          <w:tcPr>
-            <w:tcW w:w="1029" w:type="dxa"/>
+              <w:t xml:space="preserve">1. Persist the offline tap queue across a power loss, or document the residual risk</w:t>
+            </w:r>
+          </w:p>
+        </w:tc>
+        <w:tc>
+          <w:tcPr>
+            <w:tcW w:w="945" w:type="dxa"/>
             <w:vAlign w:val="top"/>
             <w:hideMark/>
           </w:tcPr>
@@ -950,50 +950,52 @@
         </w:tc>
         <w:tc>
           <w:tcPr>
-            <w:tcW w:w="2152" w:type="dxa"/>
-            <w:vAlign w:val="top"/>
-            <w:hideMark/>
-          </w:tcPr>
-          <w:p>
-            <w:pPr>
-              <w:spacing w:after="0" w:line="240" w:lineRule="auto"/>
-              <w:contextualSpacing/>
-              <w:rPr>
-                <w:rFonts w:ascii="Times New Roman" w:hAnsi="Times New Roman" w:cs="Times New Roman"/>
-              </w:rPr>
-            </w:pPr>
-            <w:r>
-              <w:rPr>
-                <w:rFonts w:ascii="Times New Roman" w:hAnsi="Times New Roman" w:cs="Times New Roman"/>
-                <w:sz w:val="18"/>
-                <w:szCs w:val="18"/>
-              </w:rPr>
-              <w:t xml:space="preserve">Joshkirby Tyler M. Bote</w:t>
-            </w:r>
-          </w:p>
-        </w:tc>
-        <w:tc>
-          <w:tcPr>
-            <w:tcW w:w="1310" w:type="dxa"/>
-            <w:vAlign w:val="top"/>
-            <w:hideMark/>
-          </w:tcPr>
-          <w:p>
-            <w:pPr>
-              <w:spacing w:after="0" w:line="240" w:lineRule="auto"/>
-              <w:contextualSpacing/>
-              <w:rPr>
-                <w:rFonts w:ascii="Times New Roman" w:hAnsi="Times New Roman" w:cs="Times New Roman"/>
-              </w:rPr>
-            </w:pPr>
-            <w:r>
-              <w:rPr>
-                <w:rFonts w:ascii="Times New Roman" w:hAnsi="Times New Roman" w:cs="Times New Roman"/>
-                <w:color w:val="1E7B34"/>
-                <w:sz w:val="18"/>
-                <w:szCs w:val="18"/>
-              </w:rPr>
-              <w:t xml:space="preserve">Completed</w:t>
+            <w:tcW w:w="2174" w:type="dxa"/>
+            <w:vAlign w:val="top"/>
+            <w:hideMark/>
+          </w:tcPr>
+          <w:p>
+            <w:pPr>
+              <w:spacing w:after="0" w:line="240" w:lineRule="auto"/>
+              <w:contextualSpacing/>
+              <w:rPr>
+                <w:rFonts w:ascii="Times New Roman" w:hAnsi="Times New Roman" w:cs="Times New Roman"/>
+              </w:rPr>
+            </w:pPr>
+            <w:r>
+              <w:rPr>
+                <w:rFonts w:ascii="Times New Roman" w:hAnsi="Times New Roman" w:cs="Times New Roman"/>
+                <w:sz w:val="18"/>
+                <w:szCs w:val="18"/>
+              </w:rPr>
+              <w:t xml:space="preserve">Naph Yvan P. Villamar</w:t>
+            </w:r>
+          </w:p>
+        </w:tc>
+        <w:tc>
+          <w:tcPr>
+            <w:tcW w:w="1796" w:type="dxa"/>
+            <w:vAlign w:val="top"/>
+            <w:hideMark/>
+          </w:tcPr>
+          <w:p>
+            <w:pPr>
+              <w:spacing w:after="0" w:line="240" w:lineRule="auto"/>
+              <w:contextualSpacing/>
+              <w:jc w:val="left"/>
+              <w:rPr>
+                <w:rFonts w:ascii="Times New Roman" w:hAnsi="Times New Roman" w:cs="Times New Roman"/>
+              </w:rPr>
+            </w:pPr>
+            <w:r>
+              <w:rPr>
+                <w:rFonts w:ascii="Times New Roman" w:hAnsi="Times New Roman" w:cs="Times New Roman"/>
+                <w:sz w:val="18"/>
+                <w:szCs w:val="18"/>
+              </w:rPr>
+              <w:t xml:space="preserve">In Progress</w:t>
+              <w:br/>
+              <w:t xml:space="preserve">(code done; ESP32 power-cut bench test pending)</w:t>
             </w:r>
           </w:p>
         </w:tc>
@@ -1004,7 +1006,7 @@
         </w:trPr>
         <w:tc>
           <w:tcPr>
-            <w:tcW w:w="4867" w:type="dxa"/>
+            <w:tcW w:w="4443" w:type="dxa"/>
             <w:vAlign w:val="top"/>
             <w:hideMark/>
           </w:tcPr>
@@ -1025,13 +1027,13 @@
                 <w:sz w:val="18"/>
                 <w:szCs w:val="18"/>
               </w:rPr>
-              <w:t xml:space="preserve">E2. Session opens by itself when the teacher scans a finger; no button to click on the web page</w:t>
-            </w:r>
-          </w:p>
-        </w:tc>
-        <w:tc>
-          <w:tcPr>
-            <w:tcW w:w="1029" w:type="dxa"/>
+              <w:t xml:space="preserve">2. Expose biometric-override (password failover) usage on the administrator dashboard</w:t>
+            </w:r>
+          </w:p>
+        </w:tc>
+        <w:tc>
+          <w:tcPr>
+            <w:tcW w:w="945" w:type="dxa"/>
             <w:vAlign w:val="top"/>
             <w:hideMark/>
           </w:tcPr>
@@ -1055,7 +1057,7 @@
         </w:tc>
         <w:tc>
           <w:tcPr>
-            <w:tcW w:w="2152" w:type="dxa"/>
+            <w:tcW w:w="2174" w:type="dxa"/>
             <w:vAlign w:val="top"/>
             <w:hideMark/>
           </w:tcPr>
@@ -1079,7 +1081,7 @@
         </w:tc>
         <w:tc>
           <w:tcPr>
-            <w:tcW w:w="1310" w:type="dxa"/>
+            <w:tcW w:w="1796" w:type="dxa"/>
             <w:vAlign w:val="top"/>
             <w:hideMark/>
           </w:tcPr>
@@ -1109,7 +1111,7 @@
         </w:trPr>
         <w:tc>
           <w:tcPr>
-            <w:tcW w:w="4867" w:type="dxa"/>
+            <w:tcW w:w="4443" w:type="dxa"/>
             <w:vAlign w:val="top"/>
             <w:hideMark/>
           </w:tcPr>
@@ -1130,61 +1132,62 @@
                 <w:sz w:val="18"/>
                 <w:szCs w:val="18"/>
               </w:rPr>
-              <w:t xml:space="preserve">E3. Audible tap alerts on every teacher page, and refused tap-outs announced instead of silent</w:t>
-            </w:r>
-          </w:p>
-        </w:tc>
-        <w:tc>
-          <w:tcPr>
-            <w:tcW w:w="1029" w:type="dxa"/>
-            <w:vAlign w:val="top"/>
-            <w:hideMark/>
-          </w:tcPr>
-          <w:p>
-            <w:pPr>
-              <w:spacing w:after="0" w:line="240" w:lineRule="auto"/>
-              <w:contextualSpacing/>
-              <w:rPr>
-                <w:rFonts w:ascii="Times New Roman" w:hAnsi="Times New Roman" w:cs="Times New Roman"/>
-              </w:rPr>
-            </w:pPr>
-            <w:r>
-              <w:rPr>
-                <w:rFonts w:ascii="Times New Roman" w:hAnsi="Times New Roman" w:cs="Times New Roman"/>
-                <w:sz w:val="18"/>
-                <w:szCs w:val="18"/>
-              </w:rPr>
-              <w:t xml:space="preserve">Medium</w:t>
-            </w:r>
-          </w:p>
-        </w:tc>
-        <w:tc>
-          <w:tcPr>
-            <w:tcW w:w="2152" w:type="dxa"/>
-            <w:vAlign w:val="top"/>
-            <w:hideMark/>
-          </w:tcPr>
-          <w:p>
-            <w:pPr>
-              <w:spacing w:after="0" w:line="240" w:lineRule="auto"/>
-              <w:contextualSpacing/>
-              <w:rPr>
-                <w:rFonts w:ascii="Times New Roman" w:hAnsi="Times New Roman" w:cs="Times New Roman"/>
-              </w:rPr>
-            </w:pPr>
-            <w:r>
-              <w:rPr>
-                <w:rFonts w:ascii="Times New Roman" w:hAnsi="Times New Roman" w:cs="Times New Roman"/>
-                <w:sz w:val="18"/>
-                <w:szCs w:val="18"/>
-              </w:rPr>
-              <w:t xml:space="preserve">Ched Nikko P. Pangilinan</w:t>
-            </w:r>
-          </w:p>
-        </w:tc>
-        <w:tc>
-          <w:tcPr>
-            <w:tcW w:w="1310" w:type="dxa"/>
+              <w:t xml:space="preserve">3. Complete unit and integration testing across all modules; resolve every High defect before UAT</w:t>
+            </w:r>
+          </w:p>
+        </w:tc>
+        <w:tc>
+          <w:tcPr>
+            <w:tcW w:w="945" w:type="dxa"/>
+            <w:vAlign w:val="top"/>
+            <w:hideMark/>
+          </w:tcPr>
+          <w:p>
+            <w:pPr>
+              <w:spacing w:after="0" w:line="240" w:lineRule="auto"/>
+              <w:contextualSpacing/>
+              <w:rPr>
+                <w:rFonts w:ascii="Times New Roman" w:hAnsi="Times New Roman" w:cs="Times New Roman"/>
+              </w:rPr>
+            </w:pPr>
+            <w:r>
+              <w:rPr>
+                <w:rFonts w:ascii="Times New Roman" w:hAnsi="Times New Roman" w:cs="Times New Roman"/>
+                <w:sz w:val="18"/>
+                <w:szCs w:val="18"/>
+              </w:rPr>
+              <w:t xml:space="preserve">High</w:t>
+            </w:r>
+          </w:p>
+        </w:tc>
+        <w:tc>
+          <w:tcPr>
+            <w:tcW w:w="2174" w:type="dxa"/>
+            <w:vAlign w:val="top"/>
+            <w:hideMark/>
+          </w:tcPr>
+          <w:p>
+            <w:pPr>
+              <w:spacing w:after="0" w:line="240" w:lineRule="auto"/>
+              <w:contextualSpacing/>
+              <w:jc w:val="left"/>
+              <w:rPr>
+                <w:rFonts w:ascii="Times New Roman" w:hAnsi="Times New Roman" w:cs="Times New Roman"/>
+              </w:rPr>
+            </w:pPr>
+            <w:r>
+              <w:rPr>
+                <w:rFonts w:ascii="Times New Roman" w:hAnsi="Times New Roman" w:cs="Times New Roman"/>
+                <w:sz w:val="18"/>
+                <w:szCs w:val="18"/>
+              </w:rPr>
+              <w:t xml:space="preserve">Naph Yvan P. Villamar / Ched Nikko P. Pangilinan</w:t>
+            </w:r>
+          </w:p>
+        </w:tc>
+        <w:tc>
+          <w:tcPr>
+            <w:tcW w:w="1796" w:type="dxa"/>
             <w:vAlign w:val="top"/>
             <w:hideMark/>
           </w:tcPr>
@@ -1214,7 +1217,7 @@
         </w:trPr>
         <w:tc>
           <w:tcPr>
-            <w:tcW w:w="4867" w:type="dxa"/>
+            <w:tcW w:w="4443" w:type="dxa"/>
             <w:vAlign w:val="top"/>
             <w:hideMark/>
           </w:tcPr>
@@ -1235,80 +1238,81 @@
                 <w:sz w:val="18"/>
                 <w:szCs w:val="18"/>
               </w:rPr>
-              <w:t xml:space="preserve">E4. Reports: quick summary wizard, per-student school-year summary, printable student attendance cards, clearer filters, colour-coded status</w:t>
-            </w:r>
-          </w:p>
-        </w:tc>
-        <w:tc>
-          <w:tcPr>
-            <w:tcW w:w="1029" w:type="dxa"/>
-            <w:vAlign w:val="top"/>
-            <w:hideMark/>
-          </w:tcPr>
-          <w:p>
-            <w:pPr>
-              <w:spacing w:after="0" w:line="240" w:lineRule="auto"/>
-              <w:contextualSpacing/>
-              <w:rPr>
-                <w:rFonts w:ascii="Times New Roman" w:hAnsi="Times New Roman" w:cs="Times New Roman"/>
-              </w:rPr>
-            </w:pPr>
-            <w:r>
-              <w:rPr>
-                <w:rFonts w:ascii="Times New Roman" w:hAnsi="Times New Roman" w:cs="Times New Roman"/>
-                <w:sz w:val="18"/>
-                <w:szCs w:val="18"/>
-              </w:rPr>
-              <w:t xml:space="preserve">High</w:t>
-            </w:r>
-          </w:p>
-        </w:tc>
-        <w:tc>
-          <w:tcPr>
-            <w:tcW w:w="2152" w:type="dxa"/>
-            <w:vAlign w:val="top"/>
-            <w:hideMark/>
-          </w:tcPr>
-          <w:p>
-            <w:pPr>
-              <w:spacing w:after="0" w:line="240" w:lineRule="auto"/>
-              <w:contextualSpacing/>
-              <w:rPr>
-                <w:rFonts w:ascii="Times New Roman" w:hAnsi="Times New Roman" w:cs="Times New Roman"/>
-              </w:rPr>
-            </w:pPr>
-            <w:r>
-              <w:rPr>
-                <w:rFonts w:ascii="Times New Roman" w:hAnsi="Times New Roman" w:cs="Times New Roman"/>
-                <w:sz w:val="18"/>
-                <w:szCs w:val="18"/>
-              </w:rPr>
-              <w:t xml:space="preserve">Naph Yvan P. Villamar</w:t>
-            </w:r>
-          </w:p>
-        </w:tc>
-        <w:tc>
-          <w:tcPr>
-            <w:tcW w:w="1310" w:type="dxa"/>
-            <w:vAlign w:val="top"/>
-            <w:hideMark/>
-          </w:tcPr>
-          <w:p>
-            <w:pPr>
-              <w:spacing w:after="0" w:line="240" w:lineRule="auto"/>
-              <w:contextualSpacing/>
-              <w:rPr>
-                <w:rFonts w:ascii="Times New Roman" w:hAnsi="Times New Roman" w:cs="Times New Roman"/>
-              </w:rPr>
-            </w:pPr>
-            <w:r>
-              <w:rPr>
-                <w:rFonts w:ascii="Times New Roman" w:hAnsi="Times New Roman" w:cs="Times New Roman"/>
-                <w:color w:val="1E7B34"/>
+              <w:t xml:space="preserve">4. Make applied report filters explicit and colour the Status column in previews</w:t>
+            </w:r>
+          </w:p>
+        </w:tc>
+        <w:tc>
+          <w:tcPr>
+            <w:tcW w:w="945" w:type="dxa"/>
+            <w:vAlign w:val="top"/>
+            <w:hideMark/>
+          </w:tcPr>
+          <w:p>
+            <w:pPr>
+              <w:spacing w:after="0" w:line="240" w:lineRule="auto"/>
+              <w:contextualSpacing/>
+              <w:rPr>
+                <w:rFonts w:ascii="Times New Roman" w:hAnsi="Times New Roman" w:cs="Times New Roman"/>
+              </w:rPr>
+            </w:pPr>
+            <w:r>
+              <w:rPr>
+                <w:rFonts w:ascii="Times New Roman" w:hAnsi="Times New Roman" w:cs="Times New Roman"/>
+                <w:sz w:val="18"/>
+                <w:szCs w:val="18"/>
+              </w:rPr>
+              <w:t xml:space="preserve">Medium</w:t>
+            </w:r>
+          </w:p>
+        </w:tc>
+        <w:tc>
+          <w:tcPr>
+            <w:tcW w:w="2174" w:type="dxa"/>
+            <w:vAlign w:val="top"/>
+            <w:hideMark/>
+          </w:tcPr>
+          <w:p>
+            <w:pPr>
+              <w:spacing w:after="0" w:line="240" w:lineRule="auto"/>
+              <w:contextualSpacing/>
+              <w:rPr>
+                <w:rFonts w:ascii="Times New Roman" w:hAnsi="Times New Roman" w:cs="Times New Roman"/>
+              </w:rPr>
+            </w:pPr>
+            <w:r>
+              <w:rPr>
+                <w:rFonts w:ascii="Times New Roman" w:hAnsi="Times New Roman" w:cs="Times New Roman"/>
+                <w:sz w:val="18"/>
+                <w:szCs w:val="18"/>
+              </w:rPr>
+              <w:t xml:space="preserve">Ched Nikko P. Pangilinan</w:t>
+            </w:r>
+          </w:p>
+        </w:tc>
+        <w:tc>
+          <w:tcPr>
+            <w:tcW w:w="1796" w:type="dxa"/>
+            <w:vAlign w:val="top"/>
+            <w:hideMark/>
+          </w:tcPr>
+          <w:p>
+            <w:pPr>
+              <w:spacing w:after="0" w:line="240" w:lineRule="auto"/>
+              <w:contextualSpacing/>
+              <w:rPr>
+                <w:rFonts w:ascii="Times New Roman" w:hAnsi="Times New Roman" w:cs="Times New Roman"/>
+              </w:rPr>
+            </w:pPr>
+            <w:r>
+              <w:rPr>
+                <w:rFonts w:ascii="Times New Roman" w:hAnsi="Times New Roman" w:cs="Times New Roman"/>
                 <w:sz w:val="18"/>
                 <w:szCs w:val="18"/>
               </w:rPr>
               <w:t xml:space="preserve">Completed</w:t>
+              <w:br/>
+              <w:t xml:space="preserve">(Sep 8, 2026)</w:t>
             </w:r>
           </w:p>
         </w:tc>
@@ -1319,7 +1323,7 @@
         </w:trPr>
         <w:tc>
           <w:tcPr>
-            <w:tcW w:w="4867" w:type="dxa"/>
+            <w:tcW w:w="4443" w:type="dxa"/>
             <w:vAlign w:val="top"/>
             <w:hideMark/>
           </w:tcPr>
@@ -1340,80 +1344,81 @@
                 <w:sz w:val="18"/>
                 <w:szCs w:val="18"/>
               </w:rPr>
-              <w:t xml:space="preserve">E5. Interface clean-up: sign-in logo panel, clearer menu names ("Classroom Terminals", "Oversight"), redundant page subtitles removed</w:t>
-            </w:r>
-          </w:p>
-        </w:tc>
-        <w:tc>
-          <w:tcPr>
-            <w:tcW w:w="1029" w:type="dxa"/>
-            <w:vAlign w:val="top"/>
-            <w:hideMark/>
-          </w:tcPr>
-          <w:p>
-            <w:pPr>
-              <w:spacing w:after="0" w:line="240" w:lineRule="auto"/>
-              <w:contextualSpacing/>
-              <w:rPr>
-                <w:rFonts w:ascii="Times New Roman" w:hAnsi="Times New Roman" w:cs="Times New Roman"/>
-              </w:rPr>
-            </w:pPr>
-            <w:r>
-              <w:rPr>
-                <w:rFonts w:ascii="Times New Roman" w:hAnsi="Times New Roman" w:cs="Times New Roman"/>
-                <w:sz w:val="18"/>
-                <w:szCs w:val="18"/>
-              </w:rPr>
-              <w:t xml:space="preserve">Low</w:t>
-            </w:r>
-          </w:p>
-        </w:tc>
-        <w:tc>
-          <w:tcPr>
-            <w:tcW w:w="2152" w:type="dxa"/>
-            <w:vAlign w:val="top"/>
-            <w:hideMark/>
-          </w:tcPr>
-          <w:p>
-            <w:pPr>
-              <w:spacing w:after="0" w:line="240" w:lineRule="auto"/>
-              <w:contextualSpacing/>
-              <w:rPr>
-                <w:rFonts w:ascii="Times New Roman" w:hAnsi="Times New Roman" w:cs="Times New Roman"/>
-              </w:rPr>
-            </w:pPr>
-            <w:r>
-              <w:rPr>
-                <w:rFonts w:ascii="Times New Roman" w:hAnsi="Times New Roman" w:cs="Times New Roman"/>
-                <w:sz w:val="18"/>
-                <w:szCs w:val="18"/>
-              </w:rPr>
-              <w:t xml:space="preserve">Naph Yvan P. Villamar</w:t>
-            </w:r>
-          </w:p>
-        </w:tc>
-        <w:tc>
-          <w:tcPr>
-            <w:tcW w:w="1310" w:type="dxa"/>
-            <w:vAlign w:val="top"/>
-            <w:hideMark/>
-          </w:tcPr>
-          <w:p>
-            <w:pPr>
-              <w:spacing w:after="0" w:line="240" w:lineRule="auto"/>
-              <w:contextualSpacing/>
-              <w:rPr>
-                <w:rFonts w:ascii="Times New Roman" w:hAnsi="Times New Roman" w:cs="Times New Roman"/>
-              </w:rPr>
-            </w:pPr>
-            <w:r>
-              <w:rPr>
-                <w:rFonts w:ascii="Times New Roman" w:hAnsi="Times New Roman" w:cs="Times New Roman"/>
-                <w:color w:val="1E7B34"/>
-                <w:sz w:val="18"/>
-                <w:szCs w:val="18"/>
-              </w:rPr>
-              <w:t xml:space="preserve">Completed</w:t>
+              <w:t xml:space="preserve">5. Prepare the user manual, installation guide and updated technical documentation</w:t>
+            </w:r>
+          </w:p>
+        </w:tc>
+        <w:tc>
+          <w:tcPr>
+            <w:tcW w:w="945" w:type="dxa"/>
+            <w:vAlign w:val="top"/>
+            <w:hideMark/>
+          </w:tcPr>
+          <w:p>
+            <w:pPr>
+              <w:spacing w:after="0" w:line="240" w:lineRule="auto"/>
+              <w:contextualSpacing/>
+              <w:rPr>
+                <w:rFonts w:ascii="Times New Roman" w:hAnsi="Times New Roman" w:cs="Times New Roman"/>
+              </w:rPr>
+            </w:pPr>
+            <w:r>
+              <w:rPr>
+                <w:rFonts w:ascii="Times New Roman" w:hAnsi="Times New Roman" w:cs="Times New Roman"/>
+                <w:sz w:val="18"/>
+                <w:szCs w:val="18"/>
+              </w:rPr>
+              <w:t xml:space="preserve">Medium</w:t>
+            </w:r>
+          </w:p>
+        </w:tc>
+        <w:tc>
+          <w:tcPr>
+            <w:tcW w:w="2174" w:type="dxa"/>
+            <w:vAlign w:val="top"/>
+            <w:hideMark/>
+          </w:tcPr>
+          <w:p>
+            <w:pPr>
+              <w:spacing w:after="0" w:line="240" w:lineRule="auto"/>
+              <w:contextualSpacing/>
+              <w:rPr>
+                <w:rFonts w:ascii="Times New Roman" w:hAnsi="Times New Roman" w:cs="Times New Roman"/>
+              </w:rPr>
+            </w:pPr>
+            <w:r>
+              <w:rPr>
+                <w:rFonts w:ascii="Times New Roman" w:hAnsi="Times New Roman" w:cs="Times New Roman"/>
+                <w:sz w:val="18"/>
+                <w:szCs w:val="18"/>
+              </w:rPr>
+              <w:t xml:space="preserve">Joshkirby Tyler M. Bote</w:t>
+            </w:r>
+          </w:p>
+        </w:tc>
+        <w:tc>
+          <w:tcPr>
+            <w:tcW w:w="1796" w:type="dxa"/>
+            <w:vAlign w:val="top"/>
+            <w:hideMark/>
+          </w:tcPr>
+          <w:p>
+            <w:pPr>
+              <w:spacing w:after="0" w:line="240" w:lineRule="auto"/>
+              <w:contextualSpacing/>
+              <w:rPr>
+                <w:rFonts w:ascii="Times New Roman" w:hAnsi="Times New Roman" w:cs="Times New Roman"/>
+              </w:rPr>
+            </w:pPr>
+            <w:r>
+              <w:rPr>
+                <w:rFonts w:ascii="Times New Roman" w:hAnsi="Times New Roman" w:cs="Times New Roman"/>
+                <w:sz w:val="18"/>
+                <w:szCs w:val="18"/>
+              </w:rPr>
+              <w:t xml:space="preserve">Not Started</w:t>
+              <w:br/>
+              <w:t xml:space="preserve">(target Week 8)</w:t>
             </w:r>
           </w:p>
         </w:tc>
@@ -1424,7 +1429,7 @@
         </w:trPr>
         <w:tc>
           <w:tcPr>
-            <w:tcW w:w="4867" w:type="dxa"/>
+            <w:tcW w:w="4443" w:type="dxa"/>
             <w:vAlign w:val="top"/>
             <w:hideMark/>
           </w:tcPr>
@@ -1445,13 +1450,13 @@
                 <w:sz w:val="18"/>
                 <w:szCs w:val="18"/>
               </w:rPr>
-              <w:t xml:space="preserve">E6. Installation diagnostic tool (find.bat) to troubleshoot a school PC set-up</w:t>
-            </w:r>
-          </w:p>
-        </w:tc>
-        <w:tc>
-          <w:tcPr>
-            <w:tcW w:w="1029" w:type="dxa"/>
+              <w:t xml:space="preserve">6. Verify both classroom terminals under sustained load and confirm LED feedback in the actual rooms</w:t>
+            </w:r>
+          </w:p>
+        </w:tc>
+        <w:tc>
+          <w:tcPr>
+            <w:tcW w:w="945" w:type="dxa"/>
             <w:vAlign w:val="top"/>
             <w:hideMark/>
           </w:tcPr>
@@ -1475,50 +1480,51 @@
         </w:tc>
         <w:tc>
           <w:tcPr>
-            <w:tcW w:w="2152" w:type="dxa"/>
-            <w:vAlign w:val="top"/>
-            <w:hideMark/>
-          </w:tcPr>
-          <w:p>
-            <w:pPr>
-              <w:spacing w:after="0" w:line="240" w:lineRule="auto"/>
-              <w:contextualSpacing/>
-              <w:rPr>
-                <w:rFonts w:ascii="Times New Roman" w:hAnsi="Times New Roman" w:cs="Times New Roman"/>
-              </w:rPr>
-            </w:pPr>
-            <w:r>
-              <w:rPr>
-                <w:rFonts w:ascii="Times New Roman" w:hAnsi="Times New Roman" w:cs="Times New Roman"/>
-                <w:sz w:val="18"/>
-                <w:szCs w:val="18"/>
-              </w:rPr>
-              <w:t xml:space="preserve">Ched Nikko P. Pangilinan</w:t>
-            </w:r>
-          </w:p>
-        </w:tc>
-        <w:tc>
-          <w:tcPr>
-            <w:tcW w:w="1310" w:type="dxa"/>
-            <w:vAlign w:val="top"/>
-            <w:hideMark/>
-          </w:tcPr>
-          <w:p>
-            <w:pPr>
-              <w:spacing w:after="0" w:line="240" w:lineRule="auto"/>
-              <w:contextualSpacing/>
-              <w:rPr>
-                <w:rFonts w:ascii="Times New Roman" w:hAnsi="Times New Roman" w:cs="Times New Roman"/>
-              </w:rPr>
-            </w:pPr>
-            <w:r>
-              <w:rPr>
-                <w:rFonts w:ascii="Times New Roman" w:hAnsi="Times New Roman" w:cs="Times New Roman"/>
-                <w:color w:val="1E7B34"/>
-                <w:sz w:val="18"/>
-                <w:szCs w:val="18"/>
-              </w:rPr>
-              <w:t xml:space="preserve">Completed</w:t>
+            <w:tcW w:w="2174" w:type="dxa"/>
+            <w:vAlign w:val="top"/>
+            <w:hideMark/>
+          </w:tcPr>
+          <w:p>
+            <w:pPr>
+              <w:spacing w:after="0" w:line="240" w:lineRule="auto"/>
+              <w:contextualSpacing/>
+              <w:rPr>
+                <w:rFonts w:ascii="Times New Roman" w:hAnsi="Times New Roman" w:cs="Times New Roman"/>
+              </w:rPr>
+            </w:pPr>
+            <w:r>
+              <w:rPr>
+                <w:rFonts w:ascii="Times New Roman" w:hAnsi="Times New Roman" w:cs="Times New Roman"/>
+                <w:sz w:val="18"/>
+                <w:szCs w:val="18"/>
+              </w:rPr>
+              <w:t xml:space="preserve">Naph Yvan P. Villamar</w:t>
+            </w:r>
+          </w:p>
+        </w:tc>
+        <w:tc>
+          <w:tcPr>
+            <w:tcW w:w="1796" w:type="dxa"/>
+            <w:vAlign w:val="top"/>
+            <w:hideMark/>
+          </w:tcPr>
+          <w:p>
+            <w:pPr>
+              <w:spacing w:after="0" w:line="240" w:lineRule="auto"/>
+              <w:contextualSpacing/>
+              <w:rPr>
+                <w:rFonts w:ascii="Times New Roman" w:hAnsi="Times New Roman" w:cs="Times New Roman"/>
+              </w:rPr>
+            </w:pPr>
+            <w:r>
+              <w:rPr>
+                <w:rFonts w:ascii="Times New Roman" w:hAnsi="Times New Roman" w:cs="Times New Roman"/>
+                <w:sz w:val="18"/>
+                <w:szCs w:val="18"/>
+              </w:rPr>
+              <w:t xml:space="preserve">Not Started</w:t>
+              <w:br/>
+              <w:t xml:space="preserve">(target Week 8)</w:t>
             </w:r>
           </w:p>
         </w:tc>
@@ -1529,7 +1535,7 @@
         </w:trPr>
         <w:tc>
           <w:tcPr>
-            <w:tcW w:w="4867" w:type="dxa"/>
+            <w:tcW w:w="4443" w:type="dxa"/>
             <w:vAlign w:val="top"/>
             <w:hideMark/>
           </w:tcPr>
@@ -1550,80 +1556,82 @@
                 <w:sz w:val="18"/>
                 <w:szCs w:val="18"/>
               </w:rPr>
-              <w:t xml:space="preserve">E7. Systematic unit and integration testing, with correction of every defect found</w:t>
-            </w:r>
-          </w:p>
-        </w:tc>
-        <w:tc>
-          <w:tcPr>
-            <w:tcW w:w="1029" w:type="dxa"/>
-            <w:vAlign w:val="top"/>
-            <w:hideMark/>
-          </w:tcPr>
-          <w:p>
-            <w:pPr>
-              <w:spacing w:after="0" w:line="240" w:lineRule="auto"/>
-              <w:contextualSpacing/>
-              <w:rPr>
-                <w:rFonts w:ascii="Times New Roman" w:hAnsi="Times New Roman" w:cs="Times New Roman"/>
-              </w:rPr>
-            </w:pPr>
-            <w:r>
-              <w:rPr>
-                <w:rFonts w:ascii="Times New Roman" w:hAnsi="Times New Roman" w:cs="Times New Roman"/>
-                <w:sz w:val="18"/>
-                <w:szCs w:val="18"/>
-              </w:rPr>
-              <w:t xml:space="preserve">High</w:t>
-            </w:r>
-          </w:p>
-        </w:tc>
-        <w:tc>
-          <w:tcPr>
-            <w:tcW w:w="2152" w:type="dxa"/>
-            <w:vAlign w:val="top"/>
-            <w:hideMark/>
-          </w:tcPr>
-          <w:p>
-            <w:pPr>
-              <w:spacing w:after="0" w:line="240" w:lineRule="auto"/>
-              <w:contextualSpacing/>
-              <w:rPr>
-                <w:rFonts w:ascii="Times New Roman" w:hAnsi="Times New Roman" w:cs="Times New Roman"/>
-              </w:rPr>
-            </w:pPr>
-            <w:r>
-              <w:rPr>
-                <w:rFonts w:ascii="Times New Roman" w:hAnsi="Times New Roman" w:cs="Times New Roman"/>
-                <w:sz w:val="18"/>
-                <w:szCs w:val="18"/>
-              </w:rPr>
-              <w:t xml:space="preserve">All members</w:t>
-            </w:r>
-          </w:p>
-        </w:tc>
-        <w:tc>
-          <w:tcPr>
-            <w:tcW w:w="1310" w:type="dxa"/>
-            <w:vAlign w:val="top"/>
-            <w:hideMark/>
-          </w:tcPr>
-          <w:p>
-            <w:pPr>
-              <w:spacing w:after="0" w:line="240" w:lineRule="auto"/>
-              <w:contextualSpacing/>
-              <w:rPr>
-                <w:rFonts w:ascii="Times New Roman" w:hAnsi="Times New Roman" w:cs="Times New Roman"/>
-              </w:rPr>
-            </w:pPr>
-            <w:r>
-              <w:rPr>
-                <w:rFonts w:ascii="Times New Roman" w:hAnsi="Times New Roman" w:cs="Times New Roman"/>
-                <w:color w:val="1E7B34"/>
-                <w:sz w:val="18"/>
-                <w:szCs w:val="18"/>
-              </w:rPr>
-              <w:t xml:space="preserve">Completed</w:t>
+              <w:t xml:space="preserve">7. Incorporate Form 3 stakeholder recommendations not yet listed</w:t>
+            </w:r>
+          </w:p>
+        </w:tc>
+        <w:tc>
+          <w:tcPr>
+            <w:tcW w:w="945" w:type="dxa"/>
+            <w:vAlign w:val="top"/>
+            <w:hideMark/>
+          </w:tcPr>
+          <w:p>
+            <w:pPr>
+              <w:spacing w:after="0" w:line="240" w:lineRule="auto"/>
+              <w:contextualSpacing/>
+              <w:rPr>
+                <w:rFonts w:ascii="Times New Roman" w:hAnsi="Times New Roman" w:cs="Times New Roman"/>
+              </w:rPr>
+            </w:pPr>
+            <w:r>
+              <w:rPr>
+                <w:rFonts w:ascii="Times New Roman" w:hAnsi="Times New Roman" w:cs="Times New Roman"/>
+                <w:sz w:val="18"/>
+                <w:szCs w:val="18"/>
+              </w:rPr>
+              <w:t xml:space="preserve">To be set</w:t>
+            </w:r>
+          </w:p>
+        </w:tc>
+        <w:tc>
+          <w:tcPr>
+            <w:tcW w:w="2174" w:type="dxa"/>
+            <w:vAlign w:val="top"/>
+            <w:hideMark/>
+          </w:tcPr>
+          <w:p>
+            <w:pPr>
+              <w:spacing w:after="0" w:line="240" w:lineRule="auto"/>
+              <w:contextualSpacing/>
+              <w:rPr>
+                <w:rFonts w:ascii="Times New Roman" w:hAnsi="Times New Roman" w:cs="Times New Roman"/>
+              </w:rPr>
+            </w:pPr>
+            <w:r>
+              <w:rPr>
+                <w:rFonts w:ascii="Times New Roman" w:hAnsi="Times New Roman" w:cs="Times New Roman"/>
+                <w:sz w:val="18"/>
+                <w:szCs w:val="18"/>
+              </w:rPr>
+              <w:t xml:space="preserve">To be assigned</w:t>
+            </w:r>
+          </w:p>
+        </w:tc>
+        <w:tc>
+          <w:tcPr>
+            <w:tcW w:w="1796" w:type="dxa"/>
+            <w:vAlign w:val="top"/>
+            <w:hideMark/>
+          </w:tcPr>
+          <w:p>
+            <w:pPr>
+              <w:spacing w:after="0" w:line="240" w:lineRule="auto"/>
+              <w:contextualSpacing/>
+              <w:jc w:val="left"/>
+              <w:rPr>
+                <w:rFonts w:ascii="Times New Roman" w:hAnsi="Times New Roman" w:cs="Times New Roman"/>
+              </w:rPr>
+            </w:pPr>
+            <w:r>
+              <w:rPr>
+                <w:rFonts w:ascii="Times New Roman" w:hAnsi="Times New Roman" w:cs="Times New Roman"/>
+                <w:sz w:val="18"/>
+                <w:szCs w:val="18"/>
+              </w:rPr>
+              <w:t xml:space="preserve">Not Started</w:t>
+              <w:br/>
+              <w:t xml:space="preserve">(awaiting returned Form 3)</w:t>
             </w:r>
           </w:p>
         </w:tc>
@@ -1670,7 +1678,7 @@
         <w:rPr>
           <w:rFonts w:ascii="Times New Roman" w:hAnsi="Times New Roman" w:cs="Times New Roman"/>
         </w:rPr>
-        <w:t xml:space="preserve"> September 28, 2026 (all items completed on or before this date)</w:t>
+        <w:t xml:space="preserve"> Items 1–4: Week 7 (September 28, 2026); items 5–6: Week 8; item 7: once the Form 3 evaluations are consolidated</w:t>
       </w:r>
     </w:p>
     <w:p>
@@ -2061,7 +2069,6 @@
     <w:tbl>
       <w:tblPr>
         <w:tblW w:w="9359" w:type="dxa"/>
-        <w:tblInd w:w="979" w:type="dxa"/>
         <w:tblBorders>
           <w:top w:val="single" w:sz="4" w:space="0" w:color="808080"/>
           <w:left w:val="single" w:sz="4" w:space="0" w:color="808080"/>
@@ -2201,7 +2208,7 @@
                 <w:sz w:val="18"/>
                 <w:szCs w:val="18"/>
               </w:rPr>
-              <w:t xml:space="preserve">E1. Terminal must show whether a tap or scan was accepted</w:t>
+              <w:t xml:space="preserve">Held taps are lost if the classroom loses power before the network returns (40 taps in RTC memory) — High</w:t>
             </w:r>
           </w:p>
         </w:tc>
@@ -2226,7 +2233,7 @@
                 <w:sz w:val="18"/>
                 <w:szCs w:val="18"/>
               </w:rPr>
-              <w:t xml:space="preserve">Added status patterns on the ESP32 on-board LED (2 blinks = accepted, 5 = refused) with a power-on self-test; timing tuned for visibility. Commits a436699, 36a9077–bbea6cf (Sep 15–16).</w:t>
+              <w:t xml:space="preserve">Every change to the held-tap queue is now also written to the ESP32 flash (NVS) and restored at start-up when RTC memory comes up empty; a batch resent after a badly timed cut is still recorded once (server request-id check, unit test UT-07). README and FIRMWARE.md updated. Commit 747be8c. Firmware type-check passes; the power-cut test on the physical terminal is still to be done.</w:t>
             </w:r>
           </w:p>
         </w:tc>
@@ -2247,11 +2254,11 @@
             <w:r>
               <w:rPr>
                 <w:rFonts w:ascii="Times New Roman" w:hAnsi="Times New Roman" w:cs="Times New Roman"/>
-                <w:color w:val="1E7B34"/>
-                <w:sz w:val="18"/>
-                <w:szCs w:val="18"/>
-              </w:rPr>
-              <w:t xml:space="preserve">Completed</w:t>
+                <w:color w:val="B45309"/>
+                <w:sz w:val="18"/>
+                <w:szCs w:val="18"/>
+              </w:rPr>
+              <w:t xml:space="preserve">In Progress</w:t>
             </w:r>
           </w:p>
         </w:tc>
@@ -2284,7 +2291,7 @@
                 <w:sz w:val="18"/>
                 <w:szCs w:val="18"/>
               </w:rPr>
-              <w:t xml:space="preserve">E2. Teacher should not have to click anything to start attendance</w:t>
+              <w:t xml:space="preserve">Password failover instead of fingerprint is recorded but not visible at a glance — High</w:t>
             </w:r>
           </w:p>
         </w:tc>
@@ -2309,7 +2316,7 @@
                 <w:sz w:val="18"/>
                 <w:szCs w:val="18"/>
               </w:rPr>
-              <w:t xml:space="preserve">Session panel now watches the terminal; the fingerprint scan opens the class and the page updates live. Commit 6364c5e (Sep 9).</w:t>
+              <w:t xml:space="preserve">Security tile on the admin dashboard now shows "N fingerprint override(s) this week", linked to the BIOMETRIC_OVERRIDE_USED events, and "Needs attention" lists the count and number of teachers whenever it is above zero. Unit test UT-30, integration test IT-23. Commit 1f26712.</w:t>
             </w:r>
           </w:p>
         </w:tc>
@@ -2367,7 +2374,7 @@
                 <w:sz w:val="18"/>
                 <w:szCs w:val="18"/>
               </w:rPr>
-              <w:t xml:space="preserve">E3. Teachers could not tell a tap happened without watching the screen</w:t>
+              <w:t xml:space="preserve">Terminal has no display, so a student cannot read why a tap was refused — Medium</w:t>
             </w:r>
           </w:p>
         </w:tc>
@@ -2392,7 +2399,7 @@
                 <w:sz w:val="18"/>
                 <w:szCs w:val="18"/>
               </w:rPr>
-              <w:t xml:space="preserve">Tap sound on every teacher page with a speaker toggle; refused tap-outs are announced. Commits dbcce1d, c100b0e, ed384ea, 25e4ede (Sep 8).</w:t>
+              <w:t xml:space="preserve">On-board LED patterns in place (2 blinks accepted, 5 blinks refused, 160 ms), commits 36a9077–bbea6cf. Evaluation of a small OLED is deferred to the deployment build.</w:t>
             </w:r>
           </w:p>
         </w:tc>
@@ -2413,11 +2420,11 @@
             <w:r>
               <w:rPr>
                 <w:rFonts w:ascii="Times New Roman" w:hAnsi="Times New Roman" w:cs="Times New Roman"/>
-                <w:color w:val="1E7B34"/>
-                <w:sz w:val="18"/>
-                <w:szCs w:val="18"/>
-              </w:rPr>
-              <w:t xml:space="preserve">Completed</w:t>
+                <w:color w:val="B45309"/>
+                <w:sz w:val="18"/>
+                <w:szCs w:val="18"/>
+              </w:rPr>
+              <w:t xml:space="preserve">In Progress</w:t>
             </w:r>
           </w:p>
         </w:tc>
@@ -2450,7 +2457,7 @@
                 <w:sz w:val="18"/>
                 <w:szCs w:val="18"/>
               </w:rPr>
-              <w:t xml:space="preserve">E4. More useful and easier reports</w:t>
+              <w:t xml:space="preserve">Not obvious which filters were applied to a generated report — Medium</w:t>
             </w:r>
           </w:p>
         </w:tc>
@@ -2475,7 +2482,7 @@
                 <w:sz w:val="18"/>
                 <w:szCs w:val="18"/>
               </w:rPr>
-              <w:t xml:space="preserve">Quick-summary wizard, per-student per-school-year summary, printable student cards (580542a); clearer filters (de750e1); coloured status column (e1193ef).</w:t>
+              <w:t xml:space="preserve">Filter state made explicit on the administrator and teacher report tabs; Status column in previews coloured like the dashboards. Commits de750e1, e1193ef (Sep 8, before the presentation).</w:t>
             </w:r>
           </w:p>
         </w:tc>
@@ -2520,6 +2527,7 @@
             <w:pPr>
               <w:spacing w:after="0" w:line="240" w:lineRule="auto"/>
               <w:contextualSpacing/>
+              <w:jc w:val="left"/>
               <w:rPr>
                 <w:rFonts w:ascii="Times New Roman" w:hAnsi="Times New Roman" w:cs="Times New Roman"/>
                 <w:b/>
@@ -2532,7 +2540,7 @@
                 <w:sz w:val="18"/>
                 <w:szCs w:val="18"/>
               </w:rPr>
-              <w:t xml:space="preserve">E5. Cleaner, clearer interface</w:t>
+              <w:t xml:space="preserve">Internal certificate authority needs certificate renewal and root distribution — Medium</w:t>
             </w:r>
           </w:p>
         </w:tc>
@@ -2557,7 +2565,7 @@
                 <w:sz w:val="18"/>
                 <w:szCs w:val="18"/>
               </w:rPr>
-              <w:t xml:space="preserve">Logo panel on sign-in, menu renamed to "Classroom Terminals" and "Oversight", page subtitles removed. Commits b75c4a2, f931b81, d4e1964, b2425f8.</w:t>
+              <w:t xml:space="preserve">Renewal procedure documented in docs/HTTPS.md ("Renewing, about two years from now"); reissuing the server certificate keeps the existing root, so terminals are not re-flashed.</w:t>
             </w:r>
           </w:p>
         </w:tc>
@@ -2615,7 +2623,7 @@
                 <w:sz w:val="18"/>
                 <w:szCs w:val="18"/>
               </w:rPr>
-              <w:t xml:space="preserve">E6. Easier troubleshooting on the school PC</w:t>
+              <w:t xml:space="preserve">Only two classroom terminals were built — Low</w:t>
             </w:r>
           </w:p>
         </w:tc>
@@ -2640,7 +2648,7 @@
                 <w:sz w:val="18"/>
                 <w:szCs w:val="18"/>
               </w:rPr>
-              <w:t xml:space="preserve">find.bat baseline-and-compare diagnostic tool. Commit 428c41d (Sep 23).</w:t>
+              <w:t xml:space="preserve">No technical action, as agreed; recorded as a scope constraint in Chapters I and III.</w:t>
             </w:r>
           </w:p>
         </w:tc>
@@ -2698,7 +2706,7 @@
                 <w:sz w:val="18"/>
                 <w:szCs w:val="18"/>
               </w:rPr>
-              <w:t xml:space="preserve">E7. Test the system and correct defects</w:t>
+              <w:t xml:space="preserve">Enhancement plan item 3: unit and integration testing, resolve High defects</w:t>
             </w:r>
           </w:p>
         </w:tc>
@@ -2723,7 +2731,7 @@
                 <w:sz w:val="18"/>
                 <w:szCs w:val="18"/>
               </w:rPr>
-              <w:t xml:space="preserve">Ran 3 automated suites and 22 end-to-end integration tests; 5 defects fixed and re-tested (Form 5). Commits 414869a, 0ef270c (Sep 28).</w:t>
+              <w:t xml:space="preserve">Ran 3 automated suites (377 checks) and 23 end-to-end integration tests; 5 defects found and fixed, including 3 rated High (Form 5). Commits 414869a, 0ef270c.</w:t>
             </w:r>
           </w:p>
         </w:tc>
@@ -2882,7 +2890,7 @@
         <w:rPr>
           <w:rFonts w:ascii="Times New Roman" w:hAnsi="Times New Roman" w:cs="Times New Roman"/>
         </w:rPr>
-        <w:t xml:space="preserve">All seven approved enhancements are complete and in the repository. The classroom terminal now gives immediate visible feedback, attendance starts from the fingerprint scan alone, teachers hear every tap, and reports are faster to produce and print. Testing this week found five defects, the most serious being that a class reopened after an early close still refused the students it had marked absent; all five are fixed and re-tested. Evidence: Appendix figures A-1 to A-5 (before/after test output, commit log) and the repository at https://github.com/Chedisss/L-SIAMS.</w:t>
+        <w:t xml:space="preserve">Both High-priority enhancements from the Week 6 plan were implemented this week. Password openings are now counted on the administrator dashboard and flagged under Needs attention, so repeated use of the failover is noticed without opening the security log. The classroom terminal now keeps held taps in flash as well as RTC memory, so a power cut no longer loses them; this is complete in code and still needs the power-cut test on the physical terminal. Testing across all modules found five defects, three rated High; all are fixed and re-tested. The documentation (item 5) and the in-room terminal verification (item 6) remain scheduled for Week 8. Evidence: Appendix A-1 to A-6 and https://github.com/Chedisss/L-SIAMS.</w:t>
       </w:r>
     </w:p>
     <w:p>
@@ -3300,7 +3308,6 @@
     <w:tbl>
       <w:tblPr>
         <w:tblW w:w="9358" w:type="dxa"/>
-        <w:tblInd w:w="656" w:type="dxa"/>
         <w:tblBorders>
           <w:top w:val="single" w:sz="4" w:space="0" w:color="808080"/>
           <w:left w:val="single" w:sz="4" w:space="0" w:color="808080"/>
@@ -6959,7 +6966,7 @@
                 <w:sz w:val="18"/>
                 <w:szCs w:val="18"/>
               </w:rPr>
-              <w:t xml:space="preserve">119 taps/s; p95 10.3 ms</w:t>
+              <w:t xml:space="preserve">112 taps/s; p95 11.2 ms</w:t>
             </w:r>
           </w:p>
         </w:tc>
@@ -7172,7 +7179,7 @@
                 <w:sz w:val="18"/>
                 <w:szCs w:val="18"/>
               </w:rPr>
-              <w:t xml:space="preserve">UT-29 Sketch compile/type check</w:t>
+              <w:t xml:space="preserve">UT-29 Sketch compile/type check, including the new flash-backed tap queue</w:t>
             </w:r>
           </w:p>
         </w:tc>
@@ -7221,6 +7228,137 @@
                 <w:szCs w:val="18"/>
               </w:rPr>
               <w:t xml:space="preserve">OK, 0 errors, 0 warnings</w:t>
+            </w:r>
+          </w:p>
+        </w:tc>
+        <w:tc>
+          <w:tcPr>
+            <w:tcW w:w="780" w:type="dxa"/>
+            <w:vAlign w:val="top"/>
+            <w:hideMark/>
+          </w:tcPr>
+          <w:p>
+            <w:pPr>
+              <w:spacing w:after="0" w:line="240" w:lineRule="auto"/>
+              <w:contextualSpacing/>
+              <w:rPr>
+                <w:rFonts w:ascii="Times New Roman" w:hAnsi="Times New Roman" w:cs="Times New Roman"/>
+              </w:rPr>
+            </w:pPr>
+            <w:r>
+              <w:rPr>
+                <w:rFonts w:ascii="Times New Roman" w:hAnsi="Times New Roman" w:cs="Times New Roman"/>
+                <w:color w:val="1E7B34"/>
+                <w:sz w:val="18"/>
+                <w:szCs w:val="18"/>
+              </w:rPr>
+              <w:t xml:space="preserve">Pass</w:t>
+            </w:r>
+          </w:p>
+        </w:tc>
+      </w:tr>
+      <w:tr>
+        <w:trPr>
+          <w:trHeight w:val="249"/>
+          <w:cantSplit/>
+        </w:trPr>
+        <w:tc>
+          <w:tcPr>
+            <w:tcW w:w="1608" w:type="dxa"/>
+            <w:vAlign w:val="top"/>
+            <w:hideMark/>
+          </w:tcPr>
+          <w:p>
+            <w:pPr>
+              <w:spacing w:after="0" w:line="240" w:lineRule="auto"/>
+              <w:contextualSpacing/>
+              <w:rPr>
+                <w:rFonts w:ascii="Times New Roman" w:hAnsi="Times New Roman" w:cs="Times New Roman"/>
+                <w:b/>
+                <w:bCs/>
+              </w:rPr>
+            </w:pPr>
+            <w:r>
+              <w:rPr>
+                <w:rFonts w:ascii="Times New Roman" w:hAnsi="Times New Roman" w:cs="Times New Roman"/>
+                <w:sz w:val="18"/>
+                <w:szCs w:val="18"/>
+              </w:rPr>
+              <w:t xml:space="preserve">Dashboard (new)</w:t>
+            </w:r>
+          </w:p>
+        </w:tc>
+        <w:tc>
+          <w:tcPr>
+            <w:tcW w:w="2681" w:type="dxa"/>
+            <w:vAlign w:val="top"/>
+            <w:hideMark/>
+          </w:tcPr>
+          <w:p>
+            <w:pPr>
+              <w:spacing w:after="0" w:line="240" w:lineRule="auto"/>
+              <w:contextualSpacing/>
+              <w:jc w:val="left"/>
+              <w:rPr>
+                <w:rFonts w:ascii="Times New Roman" w:hAnsi="Times New Roman" w:cs="Times New Roman"/>
+              </w:rPr>
+            </w:pPr>
+            <w:r>
+              <w:rPr>
+                <w:rFonts w:ascii="Times New Roman" w:hAnsi="Times New Roman" w:cs="Times New Roman"/>
+                <w:sz w:val="18"/>
+                <w:szCs w:val="18"/>
+              </w:rPr>
+              <w:t xml:space="preserve">UT-30 Sessions opened by password are counted</w:t>
+            </w:r>
+          </w:p>
+        </w:tc>
+        <w:tc>
+          <w:tcPr>
+            <w:tcW w:w="2242" w:type="dxa"/>
+            <w:vAlign w:val="top"/>
+            <w:hideMark/>
+          </w:tcPr>
+          <w:p>
+            <w:pPr>
+              <w:spacing w:after="0" w:line="240" w:lineRule="auto"/>
+              <w:contextualSpacing/>
+              <w:jc w:val="left"/>
+              <w:rPr>
+                <w:rFonts w:ascii="Times New Roman" w:hAnsi="Times New Roman" w:cs="Times New Roman"/>
+              </w:rPr>
+            </w:pPr>
+            <w:r>
+              <w:rPr>
+                <w:rFonts w:ascii="Times New Roman" w:hAnsi="Times New Roman" w:cs="Times New Roman"/>
+                <w:sz w:val="18"/>
+                <w:szCs w:val="18"/>
+              </w:rPr>
+              <w:t xml:space="preserve">Counted for today and the week; listed under Needs attention</w:t>
+            </w:r>
+          </w:p>
+        </w:tc>
+        <w:tc>
+          <w:tcPr>
+            <w:tcW w:w="2047" w:type="dxa"/>
+            <w:vAlign w:val="top"/>
+            <w:hideMark/>
+          </w:tcPr>
+          <w:p>
+            <w:pPr>
+              <w:spacing w:after="0" w:line="240" w:lineRule="auto"/>
+              <w:contextualSpacing/>
+              <w:rPr>
+                <w:rFonts w:ascii="Times New Roman" w:hAnsi="Times New Roman" w:cs="Times New Roman"/>
+              </w:rPr>
+            </w:pPr>
+            <w:r>
+              <w:rPr>
+                <w:rFonts w:ascii="Times New Roman" w:hAnsi="Times New Roman" w:cs="Times New Roman"/>
+                <w:sz w:val="18"/>
+                <w:szCs w:val="18"/>
+              </w:rPr>
+              <w:t xml:space="preserve">3/3 passed</w:t>
             </w:r>
           </w:p>
         </w:tc>
@@ -7284,7 +7422,6 @@
     <w:tbl>
       <w:tblPr>
         <w:tblW w:w="9000" w:type="dxa"/>
-        <w:tblInd w:w="657" w:type="dxa"/>
         <w:tblBorders>
           <w:top w:val="single" w:sz="4" w:space="0" w:color="808080"/>
           <w:left w:val="single" w:sz="4" w:space="0" w:color="808080"/>
@@ -7418,7 +7555,7 @@
                 <w:sz w:val="20"/>
                 <w:szCs w:val="20"/>
               </w:rPr>
-              <w:t xml:space="preserve">29 test cases (374 automated checks)</w:t>
+              <w:t xml:space="preserve">30 test cases (377 automated checks)</w:t>
             </w:r>
           </w:p>
         </w:tc>
@@ -7470,7 +7607,7 @@
                 <w:sz w:val="20"/>
                 <w:szCs w:val="20"/>
               </w:rPr>
-              <w:t xml:space="preserve">29 (374 checks)</w:t>
+              <w:t xml:space="preserve">30 (377 checks)</w:t>
             </w:r>
           </w:p>
         </w:tc>
@@ -7556,7 +7693,7 @@
         <w:rPr>
           <w:rFonts w:ascii="Times New Roman" w:hAnsi="Times New Roman" w:cs="Times New Roman"/>
         </w:rPr>
-        <w:t xml:space="preserve"> Ched Nikko P. Pangilinan, Joshkirby Tyler M. Bote, Naph Yvan P. Villamar</w:t>
+        <w:t xml:space="preserve"> Naph Yvan P. Villamar, Ched Nikko P. Pangilinan</w:t>
       </w:r>
     </w:p>
     <w:p>
@@ -8353,7 +8490,7 @@
                 <w:sz w:val="18"/>
                 <w:szCs w:val="18"/>
               </w:rPr>
-              <w:t xml:space="preserve">IT-08 Saved: 147 | Integration Tester | section 2</w:t>
+              <w:t xml:space="preserve">IT-08 Saved: 710 | Integration Tester | section 2</w:t>
               <w:br/>
               <w:t xml:space="preserve">IT-09 Students UI 147 / DB 147; Teachers UI 7 / DB 7</w:t>
             </w:r>
@@ -8697,13 +8834,13 @@
               <w:br/>
               <w:t xml:space="preserve">IT-16 HTTP 201 SESSION_OPENED; ATT-2026-000101 | status open | roster 32</w:t>
               <w:br/>
-              <w:t xml:space="preserve">IT-17 HTTP 201: "Time in recorded for Ocampo, Adrian."; DB time_in 12:53:24 | present</w:t>
+              <w:t xml:space="preserve">IT-17 HTTP 201: "Time in recorded for Ocampo, Pedro."; DB time_in 13:13:43 | late</w:t>
               <w:br/>
               <w:t xml:space="preserve">IT-18 HTTP 201 TIME_IN_RECORDED; rows for student = 1</w:t>
               <w:br/>
               <w:t xml:space="preserve">IT-19 HTTP 403 SECTION_MISMATCH; rows written 0</w:t>
               <w:br/>
-              <w:t xml:space="preserve">IT-22 close HTTP 200 → student Absent; reopen HTTP 201 SESSION_OPENED; tap HTTP 201 → Present at 12:53:26</w:t>
+              <w:t xml:space="preserve">IT-22 close HTTP 200 → student Absent; reopen HTTP 201 SESSION_OPENED; tap HTTP 201 → Late at 13:13:45</w:t>
             </w:r>
           </w:p>
         </w:tc>
@@ -8844,6 +8981,116 @@
           </w:p>
         </w:tc>
       </w:tr>
+      <w:tr>
+        <w:trPr>
+          <w:trHeight w:val="243"/>
+          <w:cantSplit/>
+        </w:trPr>
+        <w:tc>
+          <w:tcPr>
+            <w:tcW w:w="1778" w:type="dxa"/>
+            <w:vAlign w:val="top"/>
+            <w:hideMark/>
+          </w:tcPr>
+          <w:p>
+            <w:pPr>
+              <w:spacing w:after="0" w:line="240" w:lineRule="auto"/>
+              <w:contextualSpacing/>
+              <w:jc w:val="left"/>
+              <w:rPr>
+                <w:rFonts w:ascii="Times New Roman" w:hAnsi="Times New Roman" w:cs="Times New Roman"/>
+              </w:rPr>
+            </w:pPr>
+            <w:r>
+              <w:rPr>
+                <w:rFonts w:ascii="Times New Roman" w:hAnsi="Times New Roman" w:cs="Times New Roman"/>
+                <w:b/>
+                <w:sz w:val="18"/>
+                <w:szCs w:val="18"/>
+              </w:rPr>
+              <w:t xml:space="preserve">Security ↔ Dashboard (new)</w:t>
+              <w:br/>
+              <w:t xml:space="preserve">(IT-23)</w:t>
+            </w:r>
+          </w:p>
+        </w:tc>
+        <w:tc>
+          <w:tcPr>
+            <w:tcW w:w="2433" w:type="dxa"/>
+            <w:vAlign w:val="top"/>
+            <w:hideMark/>
+          </w:tcPr>
+          <w:p>
+            <w:pPr>
+              <w:spacing w:after="0" w:line="240" w:lineRule="auto"/>
+              <w:contextualSpacing/>
+              <w:jc w:val="left"/>
+              <w:rPr>
+                <w:rFonts w:ascii="Times New Roman" w:hAnsi="Times New Roman" w:cs="Times New Roman"/>
+              </w:rPr>
+            </w:pPr>
+            <w:r>
+              <w:rPr>
+                <w:rFonts w:ascii="Times New Roman" w:hAnsi="Times New Roman" w:cs="Times New Roman"/>
+                <w:sz w:val="18"/>
+                <w:szCs w:val="18"/>
+              </w:rPr>
+              <w:t xml:space="preserve">Teacher opens the class by password; the admin dashboard counts it and lists it under Needs attention</w:t>
+            </w:r>
+          </w:p>
+        </w:tc>
+        <w:tc>
+          <w:tcPr>
+            <w:tcW w:w="4305" w:type="dxa"/>
+            <w:vAlign w:val="top"/>
+            <w:hideMark/>
+          </w:tcPr>
+          <w:p>
+            <w:pPr>
+              <w:spacing w:after="0" w:line="240" w:lineRule="auto"/>
+              <w:contextualSpacing/>
+              <w:jc w:val="left"/>
+              <w:rPr>
+                <w:rFonts w:ascii="Times New Roman" w:hAnsi="Times New Roman" w:cs="Times New Roman"/>
+              </w:rPr>
+            </w:pPr>
+            <w:r>
+              <w:rPr>
+                <w:rFonts w:ascii="Times New Roman" w:hAnsi="Times New Roman" w:cs="Times New Roman"/>
+                <w:sz w:val="18"/>
+                <w:szCs w:val="18"/>
+              </w:rPr>
+              <w:t xml:space="preserve">IT-23 HTTP 200; opened_method=password; tile shows 1 override(s); Needs-attention entry: true</w:t>
+            </w:r>
+          </w:p>
+        </w:tc>
+        <w:tc>
+          <w:tcPr>
+            <w:tcW w:w="842" w:type="dxa"/>
+            <w:vAlign w:val="top"/>
+            <w:hideMark/>
+          </w:tcPr>
+          <w:p>
+            <w:pPr>
+              <w:spacing w:after="0" w:line="240" w:lineRule="auto"/>
+              <w:contextualSpacing/>
+              <w:jc w:val="center"/>
+              <w:rPr>
+                <w:rFonts w:ascii="Times New Roman" w:hAnsi="Times New Roman" w:cs="Times New Roman"/>
+              </w:rPr>
+            </w:pPr>
+            <w:r>
+              <w:rPr>
+                <w:rFonts w:ascii="Times New Roman" w:hAnsi="Times New Roman" w:cs="Times New Roman"/>
+                <w:color w:val="1E7B34"/>
+                <w:sz w:val="18"/>
+                <w:szCs w:val="18"/>
+              </w:rPr>
+              <w:t xml:space="preserve">Pass</w:t>
+            </w:r>
+          </w:p>
+        </w:tc>
+      </w:tr>
     </w:tbl>
     <w:p>
       <w:pPr>
@@ -8878,7 +9125,6 @@
     <w:tbl>
       <w:tblPr>
         <w:tblW w:w="9000" w:type="dxa"/>
-        <w:tblInd w:w="752" w:type="dxa"/>
         <w:tblBorders>
           <w:top w:val="single" w:sz="4" w:space="0" w:color="808080"/>
           <w:left w:val="single" w:sz="4" w:space="0" w:color="808080"/>
@@ -9012,7 +9258,7 @@
                 <w:sz w:val="20"/>
                 <w:szCs w:val="20"/>
               </w:rPr>
-              <w:t xml:space="preserve">22 test cases in 7 integration areas</w:t>
+              <w:t xml:space="preserve">23 test cases in 8 integration areas</w:t>
             </w:r>
           </w:p>
         </w:tc>
@@ -9064,7 +9310,7 @@
                 <w:sz w:val="20"/>
                 <w:szCs w:val="20"/>
               </w:rPr>
-              <w:t xml:space="preserve">22</w:t>
+              <w:t xml:space="preserve">23</w:t>
             </w:r>
           </w:p>
         </w:tc>
@@ -9681,7 +9927,6 @@
     <w:tbl>
       <w:tblPr>
         <w:tblW w:w="9359" w:type="dxa"/>
-        <w:tblInd w:w="562" w:type="dxa"/>
         <w:tblBorders>
           <w:top w:val="single" w:sz="4" w:space="0" w:color="808080"/>
           <w:left w:val="single" w:sz="4" w:space="0" w:color="808080"/>
@@ -11218,7 +11463,6 @@
     <w:tbl>
       <w:tblPr>
         <w:tblW w:w="9360" w:type="dxa"/>
-        <w:tblInd w:w="815" w:type="dxa"/>
         <w:tblBorders>
           <w:top w:val="single" w:sz="4" w:space="0" w:color="808080"/>
           <w:left w:val="single" w:sz="4" w:space="0" w:color="808080"/>
@@ -11388,7 +11632,7 @@
                 <w:sz w:val="18"/>
                 <w:szCs w:val="18"/>
               </w:rPr>
-              <w:t xml:space="preserve">Automated end-to-end integration tests (22 cases) that sign every terminal request exactly as the ESP32 does</w:t>
+              <w:t xml:space="preserve">Automated end-to-end integration tests (23 cases) that sign every terminal request exactly as the ESP32 does</w:t>
             </w:r>
           </w:p>
         </w:tc>
@@ -11587,7 +11831,7 @@
                 <w:sz w:val="18"/>
                 <w:szCs w:val="18"/>
               </w:rPr>
-              <w:t xml:space="preserve">119 taps per second sustained; 95% of taps processed in 10.3 ms (target under 800 ms).</w:t>
+              <w:t xml:space="preserve">112 taps per second sustained; 95% of taps processed in 11.2 ms (target under 800 ms).</w:t>
             </w:r>
           </w:p>
         </w:tc>
@@ -12123,7 +12367,6 @@
     <w:tbl>
       <w:tblPr>
         <w:tblW w:w="9000" w:type="dxa"/>
-        <w:tblInd w:w="1547" w:type="dxa"/>
         <w:tblBorders>
           <w:top w:val="single" w:sz="4" w:space="0" w:color="808080"/>
           <w:left w:val="single" w:sz="4" w:space="0" w:color="808080"/>
@@ -12611,7 +12854,7 @@
         <w:rPr>
           <w:rFonts w:ascii="Times New Roman" w:hAnsi="Times New Roman" w:cs="Times New Roman"/>
         </w:rPr>
-        <w:t xml:space="preserve"> 0ef270c  "Seed a terminal slot for every demo fingerprint"</w:t>
+        <w:t xml:space="preserve"> 747be8c  "Keep held taps through a power cut" (latest code change)</w:t>
       </w:r>
     </w:p>
     <w:p>
@@ -13103,7 +13346,6 @@
     <w:tbl>
       <w:tblPr>
         <w:tblW w:w="9000" w:type="dxa"/>
-        <w:tblInd w:w="474" w:type="dxa"/>
         <w:tblBorders>
           <w:top w:val="single" w:sz="4" w:space="0" w:color="808080"/>
           <w:left w:val="single" w:sz="4" w:space="0" w:color="808080"/>
@@ -14551,7 +14793,7 @@
       <w:r xmlns:a="http://schemas.openxmlformats.org/drawingml/2006/main" xmlns:pic="http://schemas.openxmlformats.org/drawingml/2006/picture">
         <w:drawing>
           <wp:inline distT="0" distB="0" distL="0" distR="0">
-            <wp:extent cx="5760720" cy="3484772"/>
+            <wp:extent cx="5760720" cy="3559963"/>
             <wp:docPr id="901" name="Evidence 901" descr="A-1. Unit testing: final run of all automated suites (Form 3)"/>
             <a:graphic>
               <a:graphicData uri="http://schemas.openxmlformats.org/drawingml/2006/picture">
@@ -14569,7 +14811,7 @@
                   <pic:spPr>
                     <a:xfrm>
                       <a:off x="0" y="0"/>
-                      <a:ext cx="5760720" cy="3484772"/>
+                      <a:ext cx="5760720" cy="3559963"/>
                     </a:xfrm>
                     <a:prstGeom prst="rect">
                       <a:avLst/>
@@ -14610,7 +14852,7 @@
       <w:r xmlns:a="http://schemas.openxmlformats.org/drawingml/2006/main" xmlns:pic="http://schemas.openxmlformats.org/drawingml/2006/picture">
         <w:drawing>
           <wp:inline distT="0" distB="0" distL="0" distR="0">
-            <wp:extent cx="5760720" cy="965903"/>
+            <wp:extent cx="5760720" cy="1043985"/>
             <wp:docPr id="902" name="Evidence 902" descr="A-2. BUG-001 before and after: regression test output"/>
             <a:graphic>
               <a:graphicData uri="http://schemas.openxmlformats.org/drawingml/2006/picture">
@@ -14628,7 +14870,7 @@
                   <pic:spPr>
                     <a:xfrm>
                       <a:off x="0" y="0"/>
-                      <a:ext cx="5760720" cy="965903"/>
+                      <a:ext cx="5760720" cy="1043985"/>
                     </a:xfrm>
                     <a:prstGeom prst="rect">
                       <a:avLst/>
@@ -14717,7 +14959,7 @@
           <w:sz w:val="20"/>
           <w:szCs w:val="20"/>
         </w:rPr>
-        <w:t xml:space="preserve">A-4. Integration testing: final run, 22/22 passed (Form 4)</w:t>
+        <w:t xml:space="preserve">A-4. Integration testing: final run, 23/23 passed (Form 4)</w:t>
       </w:r>
     </w:p>
     <w:p>
@@ -14728,8 +14970,8 @@
       <w:r xmlns:a="http://schemas.openxmlformats.org/drawingml/2006/main" xmlns:pic="http://schemas.openxmlformats.org/drawingml/2006/picture">
         <w:drawing>
           <wp:inline distT="0" distB="0" distL="0" distR="0">
-            <wp:extent cx="5760720" cy="4022671"/>
-            <wp:docPr id="904" name="Evidence 904" descr="A-4. Integration testing: final run, 22/22 passed (Form 4)"/>
+            <wp:extent cx="5760720" cy="4173051"/>
+            <wp:docPr id="904" name="Evidence 904" descr="A-4. Integration testing: final run, 23/23 passed (Form 4)"/>
             <a:graphic>
               <a:graphicData uri="http://schemas.openxmlformats.org/drawingml/2006/picture">
                 <pic:pic>
@@ -14746,7 +14988,7 @@
                   <pic:spPr>
                     <a:xfrm>
                       <a:off x="0" y="0"/>
-                      <a:ext cx="5760720" cy="4022671"/>
+                      <a:ext cx="5760720" cy="4173051"/>
                     </a:xfrm>
                     <a:prstGeom prst="rect">
                       <a:avLst/>
@@ -14787,7 +15029,7 @@
       <w:r xmlns:a="http://schemas.openxmlformats.org/drawingml/2006/main" xmlns:pic="http://schemas.openxmlformats.org/drawingml/2006/picture">
         <w:drawing>
           <wp:inline distT="0" distB="0" distL="0" distR="0">
-            <wp:extent cx="5760720" cy="1957835"/>
+            <wp:extent cx="5760720" cy="2113999"/>
             <wp:docPr id="905" name="Evidence 905" descr="A-5. Repository commit log (Form 2 and Form 6 evidence)"/>
             <a:graphic>
               <a:graphicData uri="http://schemas.openxmlformats.org/drawingml/2006/picture">
@@ -14805,7 +15047,7 @@
                   <pic:spPr>
                     <a:xfrm>
                       <a:off x="0" y="0"/>
-                      <a:ext cx="5760720" cy="1957835"/>
+                      <a:ext cx="5760720" cy="2113999"/>
                     </a:xfrm>
                     <a:prstGeom prst="rect">
                       <a:avLst/>
@@ -14835,7 +15077,7 @@
           <w:sz w:val="20"/>
           <w:szCs w:val="20"/>
         </w:rPr>
-        <w:t xml:space="preserve">A-6. IT-01: administrator signs in and reaches the dashboard</w:t>
+        <w:t xml:space="preserve">A-6. Enhancement 2 before and after: fingerprint overrides on the administrator dashboard (Form 2)</w:t>
       </w:r>
     </w:p>
     <w:p>
@@ -14846,13 +15088,13 @@
       <w:r xmlns:a="http://schemas.openxmlformats.org/drawingml/2006/main" xmlns:pic="http://schemas.openxmlformats.org/drawingml/2006/picture">
         <w:drawing>
           <wp:inline distT="0" distB="0" distL="0" distR="0">
-            <wp:extent cx="5760720" cy="3600450"/>
-            <wp:docPr id="906" name="Evidence 906" descr="A-6. IT-01: administrator signs in and reaches the dashboard"/>
+            <wp:extent cx="5760720" cy="1995430"/>
+            <wp:docPr id="906" name="Evidence 906" descr="A-6. Enhancement 2 before and after: fingerprint overrides on the administrator dashboard (Form 2)"/>
             <a:graphic>
               <a:graphicData uri="http://schemas.openxmlformats.org/drawingml/2006/picture">
                 <pic:pic>
                   <pic:nvPicPr>
-                    <pic:cNvPr id="906" name="01-admin-login-success.png"/>
+                    <pic:cNvPr id="906" name="e6.png"/>
                     <pic:cNvPicPr/>
                   </pic:nvPicPr>
                   <pic:blipFill>
@@ -14864,7 +15106,7 @@
                   <pic:spPr>
                     <a:xfrm>
                       <a:off x="0" y="0"/>
-                      <a:ext cx="5760720" cy="3600450"/>
+                      <a:ext cx="5760720" cy="1995430"/>
                     </a:xfrm>
                     <a:prstGeom prst="rect">
                       <a:avLst/>
@@ -14894,7 +15136,7 @@
           <w:sz w:val="20"/>
           <w:szCs w:val="20"/>
         </w:rPr>
-        <w:t xml:space="preserve">A-7. IT-02: wrong password refused</w:t>
+        <w:t xml:space="preserve">A-7. IT-01: administrator signs in and reaches the dashboard</w:t>
       </w:r>
     </w:p>
     <w:p>
@@ -14906,12 +15148,12 @@
         <w:drawing>
           <wp:inline distT="0" distB="0" distL="0" distR="0">
             <wp:extent cx="5760720" cy="3600450"/>
-            <wp:docPr id="907" name="Evidence 907" descr="A-7. IT-02: wrong password refused"/>
+            <wp:docPr id="907" name="Evidence 907" descr="A-7. IT-01: administrator signs in and reaches the dashboard"/>
             <a:graphic>
               <a:graphicData uri="http://schemas.openxmlformats.org/drawingml/2006/picture">
                 <pic:pic>
                   <pic:nvPicPr>
-                    <pic:cNvPr id="907" name="02-wrong-password.png"/>
+                    <pic:cNvPr id="907" name="01-admin-login-success.png"/>
                     <pic:cNvPicPr/>
                   </pic:nvPicPr>
                   <pic:blipFill>
@@ -14953,7 +15195,7 @@
           <w:sz w:val="20"/>
           <w:szCs w:val="20"/>
         </w:rPr>
-        <w:t xml:space="preserve">A-8. IT-04: teacher account refused on an administrator page (HTTP 403)</w:t>
+        <w:t xml:space="preserve">A-8. IT-02: wrong password refused</w:t>
       </w:r>
     </w:p>
     <w:p>
@@ -14965,12 +15207,12 @@
         <w:drawing>
           <wp:inline distT="0" distB="0" distL="0" distR="0">
             <wp:extent cx="5760720" cy="3600450"/>
-            <wp:docPr id="908" name="Evidence 908" descr="A-8. IT-04: teacher account refused on an administrator page (HTTP 403)"/>
+            <wp:docPr id="908" name="Evidence 908" descr="A-8. IT-02: wrong password refused"/>
             <a:graphic>
               <a:graphicData uri="http://schemas.openxmlformats.org/drawingml/2006/picture">
                 <pic:pic>
                   <pic:nvPicPr>
-                    <pic:cNvPr id="908" name="03-teacher-blocked-from-admin.png"/>
+                    <pic:cNvPr id="908" name="02-wrong-password.png"/>
                     <pic:cNvPicPr/>
                   </pic:nvPicPr>
                   <pic:blipFill>
@@ -15012,7 +15254,7 @@
           <w:sz w:val="20"/>
           <w:szCs w:val="20"/>
         </w:rPr>
-        <w:t xml:space="preserve">A-9. IT-06: account locked after five wrong passwords</w:t>
+        <w:t xml:space="preserve">A-9. IT-04: teacher account refused on an administrator page (HTTP 403)</w:t>
       </w:r>
     </w:p>
     <w:p>
@@ -15024,12 +15266,12 @@
         <w:drawing>
           <wp:inline distT="0" distB="0" distL="0" distR="0">
             <wp:extent cx="5760720" cy="3600450"/>
-            <wp:docPr id="909" name="Evidence 909" descr="A-9. IT-06: account locked after five wrong passwords"/>
+            <wp:docPr id="909" name="Evidence 909" descr="A-9. IT-04: teacher account refused on an administrator page (HTTP 403)"/>
             <a:graphic>
               <a:graphicData uri="http://schemas.openxmlformats.org/drawingml/2006/picture">
                 <pic:pic>
                   <pic:nvPicPr>
-                    <pic:cNvPr id="909" name="04-account-locked.png"/>
+                    <pic:cNvPr id="909" name="03-teacher-blocked-from-admin.png"/>
                     <pic:cNvPicPr/>
                   </pic:nvPicPr>
                   <pic:blipFill>
@@ -15071,7 +15313,7 @@
           <w:sz w:val="20"/>
           <w:szCs w:val="20"/>
         </w:rPr>
-        <w:t xml:space="preserve">A-10. IT-08: Add Student form filled in</w:t>
+        <w:t xml:space="preserve">A-10. IT-06: account locked after five wrong passwords</w:t>
       </w:r>
     </w:p>
     <w:p>
@@ -15083,12 +15325,12 @@
         <w:drawing>
           <wp:inline distT="0" distB="0" distL="0" distR="0">
             <wp:extent cx="5760720" cy="3600450"/>
-            <wp:docPr id="910" name="Evidence 910" descr="A-10. IT-08: Add Student form filled in"/>
+            <wp:docPr id="910" name="Evidence 910" descr="A-10. IT-06: account locked after five wrong passwords"/>
             <a:graphic>
               <a:graphicData uri="http://schemas.openxmlformats.org/drawingml/2006/picture">
                 <pic:pic>
                   <pic:nvPicPr>
-                    <pic:cNvPr id="910" name="05-add-student-form.png"/>
+                    <pic:cNvPr id="910" name="04-account-locked.png"/>
                     <pic:cNvPicPr/>
                   </pic:nvPicPr>
                   <pic:blipFill>
@@ -15130,7 +15372,7 @@
           <w:sz w:val="20"/>
           <w:szCs w:val="20"/>
         </w:rPr>
-        <w:t xml:space="preserve">A-11. IT-08: student saved to the database</w:t>
+        <w:t xml:space="preserve">A-11. IT-08: Add Student form filled in</w:t>
       </w:r>
     </w:p>
     <w:p>
@@ -15142,12 +15384,12 @@
         <w:drawing>
           <wp:inline distT="0" distB="0" distL="0" distR="0">
             <wp:extent cx="5760720" cy="3600450"/>
-            <wp:docPr id="911" name="Evidence 911" descr="A-11. IT-08: student saved to the database"/>
+            <wp:docPr id="911" name="Evidence 911" descr="A-11. IT-08: Add Student form filled in"/>
             <a:graphic>
               <a:graphicData uri="http://schemas.openxmlformats.org/drawingml/2006/picture">
                 <pic:pic>
                   <pic:nvPicPr>
-                    <pic:cNvPr id="911" name="06-add-student-saved.png"/>
+                    <pic:cNvPr id="911" name="05-add-student-form.png"/>
                     <pic:cNvPicPr/>
                   </pic:nvPicPr>
                   <pic:blipFill>
@@ -15189,7 +15431,7 @@
           <w:sz w:val="20"/>
           <w:szCs w:val="20"/>
         </w:rPr>
-        <w:t xml:space="preserve">A-12. IT-21: RFID tap from the terminal appears on the teacher dashboard</w:t>
+        <w:t xml:space="preserve">A-12. IT-08: student saved to the database</w:t>
       </w:r>
     </w:p>
     <w:p>
@@ -15201,16 +15443,75 @@
         <w:drawing>
           <wp:inline distT="0" distB="0" distL="0" distR="0">
             <wp:extent cx="5760720" cy="3600450"/>
-            <wp:docPr id="912" name="Evidence 912" descr="A-12. IT-21: RFID tap from the terminal appears on the teacher dashboard"/>
+            <wp:docPr id="912" name="Evidence 912" descr="A-12. IT-08: student saved to the database"/>
             <a:graphic>
               <a:graphicData uri="http://schemas.openxmlformats.org/drawingml/2006/picture">
                 <pic:pic>
                   <pic:nvPicPr>
-                    <pic:cNvPr id="912" name="07-teacher-dashboard-after-tap.png"/>
+                    <pic:cNvPr id="912" name="06-add-student-saved.png"/>
                     <pic:cNvPicPr/>
                   </pic:nvPicPr>
                   <pic:blipFill>
                     <a:blip r:embed="rIdEv912"/>
+                    <a:stretch>
+                      <a:fillRect/>
+                    </a:stretch>
+                  </pic:blipFill>
+                  <pic:spPr>
+                    <a:xfrm>
+                      <a:off x="0" y="0"/>
+                      <a:ext cx="5760720" cy="3600450"/>
+                    </a:xfrm>
+                    <a:prstGeom prst="rect">
+                      <a:avLst/>
+                    </a:prstGeom>
+                    <a:ln w="6350">
+                      <a:solidFill>
+                        <a:srgbClr val="A0A0A0"/>
+                      </a:solidFill>
+                    </a:ln>
+                  </pic:spPr>
+                </pic:pic>
+              </a:graphicData>
+            </a:graphic>
+          </wp:inline>
+        </w:drawing>
+      </w:r>
+    </w:p>
+    <w:p>
+      <w:pPr>
+        <w:keepNext/>
+        <w:spacing w:after="60" w:line="252" w:lineRule="auto" w:before="240"/>
+      </w:pPr>
+      <w:r>
+        <w:rPr>
+          <w:rFonts w:ascii="Times New Roman" w:hAnsi="Times New Roman" w:cs="Times New Roman"/>
+          <w:b/>
+          <w:sz w:val="20"/>
+          <w:szCs w:val="20"/>
+        </w:rPr>
+        <w:t xml:space="preserve">A-13. IT-21: RFID tap from the terminal appears on the teacher dashboard</w:t>
+      </w:r>
+    </w:p>
+    <w:p>
+      <w:pPr>
+        <w:spacing w:after="60" w:line="252" w:lineRule="auto"/>
+        <w:jc w:val="center"/>
+      </w:pPr>
+      <w:r xmlns:a="http://schemas.openxmlformats.org/drawingml/2006/main" xmlns:pic="http://schemas.openxmlformats.org/drawingml/2006/picture">
+        <w:drawing>
+          <wp:inline distT="0" distB="0" distL="0" distR="0">
+            <wp:extent cx="5760720" cy="3600450"/>
+            <wp:docPr id="913" name="Evidence 913" descr="A-13. IT-21: RFID tap from the terminal appears on the teacher dashboard"/>
+            <a:graphic>
+              <a:graphicData uri="http://schemas.openxmlformats.org/drawingml/2006/picture">
+                <pic:pic>
+                  <pic:nvPicPr>
+                    <pic:cNvPr id="913" name="07-teacher-dashboard-after-tap.png"/>
+                    <pic:cNvPicPr/>
+                  </pic:nvPicPr>
+                  <pic:blipFill>
+                    <a:blip r:embed="rIdEv913"/>
                     <a:stretch>
                       <a:fillRect/>
                     </a:stretch>

</xml_diff>

<commit_message>
Add Week 7 evidence figures 14-18 for Form 2 and Form 5
Co-Authored-By: Claude Opus 5.5 <noreply@anthropic.com>
Claude-Session: https://claude.ai/code/session_01QSVomszqQWngwxcj9sBbPY
</commit_message>
<xml_diff>
--- a/docs/week7/LSIAMS_Week7_System_Enhancement_and_Testing.docx
+++ b/docs/week7/LSIAMS_Week7_System_Enhancement_and_Testing.docx
@@ -15166,6 +15166,316 @@
           <w:rFonts w:ascii="Times New Roman" w:hAnsi="Times New Roman" w:cs="Times New Roman"/>
         </w:rPr>
         <w:t>Figure 13. IT-21 RFID tap shown on the teacher dashboard</w:t>
+      </w:r>
+    </w:p>
+    <w:p>
+      <w:pPr>
+        <w:contextualSpacing/>
+      </w:pPr>
+    </w:p>
+    <w:p>
+      <w:pPr>
+        <w:keepNext/>
+        <w:contextualSpacing/>
+        <w:jc w:val="center"/>
+      </w:pPr>
+      <w:r>
+        <w:rPr>
+          <w:noProof/>
+        </w:rPr>
+        <w:drawing>
+          <wp:inline distT="0" distB="0" distL="0" distR="0">
+            <wp:extent cx="5760720" cy="6698057"/>
+            <wp:effectExtent l="0" t="0" r="0" b="0"/>
+            <wp:docPr id="914" name="Figure 914" descr="Figure 14. Power-loss enhancement, commit 747be8c"/>
+            <wp:cNvGraphicFramePr/>
+            <a:graphic xmlns:a="http://schemas.openxmlformats.org/drawingml/2006/main">
+              <a:graphicData uri="http://schemas.openxmlformats.org/drawingml/2006/picture">
+                <pic:pic xmlns:pic="http://schemas.openxmlformats.org/drawingml/2006/picture">
+                  <pic:nvPicPr>
+                    <pic:cNvPr id="914" name="f14.png"/>
+                    <pic:cNvPicPr/>
+                  </pic:nvPicPr>
+                  <pic:blipFill>
+                    <a:blip r:embed="rId200"/>
+                    <a:stretch>
+                      <a:fillRect/>
+                    </a:stretch>
+                  </pic:blipFill>
+                  <pic:spPr>
+                    <a:xfrm>
+                      <a:off x="0" y="0"/>
+                      <a:ext cx="5760720" cy="6698057"/>
+                    </a:xfrm>
+                    <a:prstGeom prst="rect">
+                      <a:avLst/>
+                    </a:prstGeom>
+                  </pic:spPr>
+                </pic:pic>
+              </a:graphicData>
+            </a:graphic>
+          </wp:inline>
+        </w:drawing>
+      </w:r>
+    </w:p>
+    <w:p>
+      <w:pPr>
+        <w:contextualSpacing/>
+        <w:jc w:val="center"/>
+      </w:pPr>
+      <w:r>
+        <w:rPr>
+          <w:rFonts w:ascii="Times New Roman" w:hAnsi="Times New Roman" w:cs="Times New Roman"/>
+        </w:rPr>
+        <w:t>Figure 14. Power-loss enhancement, commit 747be8c</w:t>
+      </w:r>
+    </w:p>
+    <w:p>
+      <w:pPr>
+        <w:contextualSpacing/>
+      </w:pPr>
+    </w:p>
+    <w:p>
+      <w:pPr>
+        <w:keepNext/>
+        <w:contextualSpacing/>
+        <w:jc w:val="center"/>
+      </w:pPr>
+      <w:r>
+        <w:rPr>
+          <w:noProof/>
+        </w:rPr>
+        <w:drawing>
+          <wp:inline distT="0" distB="0" distL="0" distR="0">
+            <wp:extent cx="5760720" cy="4862438"/>
+            <wp:effectExtent l="0" t="0" r="0" b="0"/>
+            <wp:docPr id="915" name="Figure 915" descr="Figure 15. Enhancement commits for fingerprint overrides, report filters and LED feedback"/>
+            <wp:cNvGraphicFramePr/>
+            <a:graphic xmlns:a="http://schemas.openxmlformats.org/drawingml/2006/main">
+              <a:graphicData uri="http://schemas.openxmlformats.org/drawingml/2006/picture">
+                <pic:pic xmlns:pic="http://schemas.openxmlformats.org/drawingml/2006/picture">
+                  <pic:nvPicPr>
+                    <pic:cNvPr id="915" name="f15.png"/>
+                    <pic:cNvPicPr/>
+                  </pic:nvPicPr>
+                  <pic:blipFill>
+                    <a:blip r:embed="rId201"/>
+                    <a:stretch>
+                      <a:fillRect/>
+                    </a:stretch>
+                  </pic:blipFill>
+                  <pic:spPr>
+                    <a:xfrm>
+                      <a:off x="0" y="0"/>
+                      <a:ext cx="5760720" cy="4862438"/>
+                    </a:xfrm>
+                    <a:prstGeom prst="rect">
+                      <a:avLst/>
+                    </a:prstGeom>
+                  </pic:spPr>
+                </pic:pic>
+              </a:graphicData>
+            </a:graphic>
+          </wp:inline>
+        </w:drawing>
+      </w:r>
+    </w:p>
+    <w:p>
+      <w:pPr>
+        <w:contextualSpacing/>
+        <w:jc w:val="center"/>
+      </w:pPr>
+      <w:r>
+        <w:rPr>
+          <w:rFonts w:ascii="Times New Roman" w:hAnsi="Times New Roman" w:cs="Times New Roman"/>
+        </w:rPr>
+        <w:t>Figure 15. Enhancement commits for fingerprint overrides, report filters and LED feedback</w:t>
+      </w:r>
+    </w:p>
+    <w:p>
+      <w:pPr>
+        <w:contextualSpacing/>
+      </w:pPr>
+    </w:p>
+    <w:p>
+      <w:pPr>
+        <w:keepNext/>
+        <w:contextualSpacing/>
+        <w:jc w:val="center"/>
+      </w:pPr>
+      <w:r>
+        <w:rPr>
+          <w:noProof/>
+        </w:rPr>
+        <w:drawing>
+          <wp:inline distT="0" distB="0" distL="0" distR="0">
+            <wp:extent cx="5760720" cy="2284760"/>
+            <wp:effectExtent l="0" t="0" r="0" b="0"/>
+            <wp:docPr id="916" name="Figure 916" descr="Figure 16. Certificate renewal procedure in docs/HTTPS.md"/>
+            <wp:cNvGraphicFramePr/>
+            <a:graphic xmlns:a="http://schemas.openxmlformats.org/drawingml/2006/main">
+              <a:graphicData uri="http://schemas.openxmlformats.org/drawingml/2006/picture">
+                <pic:pic xmlns:pic="http://schemas.openxmlformats.org/drawingml/2006/picture">
+                  <pic:nvPicPr>
+                    <pic:cNvPr id="916" name="f16.png"/>
+                    <pic:cNvPicPr/>
+                  </pic:nvPicPr>
+                  <pic:blipFill>
+                    <a:blip r:embed="rId202"/>
+                    <a:stretch>
+                      <a:fillRect/>
+                    </a:stretch>
+                  </pic:blipFill>
+                  <pic:spPr>
+                    <a:xfrm>
+                      <a:off x="0" y="0"/>
+                      <a:ext cx="5760720" cy="2284760"/>
+                    </a:xfrm>
+                    <a:prstGeom prst="rect">
+                      <a:avLst/>
+                    </a:prstGeom>
+                  </pic:spPr>
+                </pic:pic>
+              </a:graphicData>
+            </a:graphic>
+          </wp:inline>
+        </w:drawing>
+      </w:r>
+    </w:p>
+    <w:p>
+      <w:pPr>
+        <w:contextualSpacing/>
+        <w:jc w:val="center"/>
+      </w:pPr>
+      <w:r>
+        <w:rPr>
+          <w:rFonts w:ascii="Times New Roman" w:hAnsi="Times New Roman" w:cs="Times New Roman"/>
+        </w:rPr>
+        <w:t>Figure 16. Certificate renewal procedure in docs/HTTPS.md</w:t>
+      </w:r>
+    </w:p>
+    <w:p>
+      <w:pPr>
+        <w:contextualSpacing/>
+      </w:pPr>
+    </w:p>
+    <w:p>
+      <w:pPr>
+        <w:keepNext/>
+        <w:contextualSpacing/>
+        <w:jc w:val="center"/>
+      </w:pPr>
+      <w:r>
+        <w:rPr>
+          <w:noProof/>
+        </w:rPr>
+        <w:drawing>
+          <wp:inline distT="0" distB="0" distL="0" distR="0">
+            <wp:extent cx="5760720" cy="3266035"/>
+            <wp:effectExtent l="0" t="0" r="0" b="0"/>
+            <wp:docPr id="917" name="Figure 917" descr="Figure 17. Fix commits for BUG-006 to BUG-009"/>
+            <wp:cNvGraphicFramePr/>
+            <a:graphic xmlns:a="http://schemas.openxmlformats.org/drawingml/2006/main">
+              <a:graphicData uri="http://schemas.openxmlformats.org/drawingml/2006/picture">
+                <pic:pic xmlns:pic="http://schemas.openxmlformats.org/drawingml/2006/picture">
+                  <pic:nvPicPr>
+                    <pic:cNvPr id="917" name="f17.png"/>
+                    <pic:cNvPicPr/>
+                  </pic:nvPicPr>
+                  <pic:blipFill>
+                    <a:blip r:embed="rId203"/>
+                    <a:stretch>
+                      <a:fillRect/>
+                    </a:stretch>
+                  </pic:blipFill>
+                  <pic:spPr>
+                    <a:xfrm>
+                      <a:off x="0" y="0"/>
+                      <a:ext cx="5760720" cy="3266035"/>
+                    </a:xfrm>
+                    <a:prstGeom prst="rect">
+                      <a:avLst/>
+                    </a:prstGeom>
+                  </pic:spPr>
+                </pic:pic>
+              </a:graphicData>
+            </a:graphic>
+          </wp:inline>
+        </w:drawing>
+      </w:r>
+    </w:p>
+    <w:p>
+      <w:pPr>
+        <w:contextualSpacing/>
+        <w:jc w:val="center"/>
+      </w:pPr>
+      <w:r>
+        <w:rPr>
+          <w:rFonts w:ascii="Times New Roman" w:hAnsi="Times New Roman" w:cs="Times New Roman"/>
+        </w:rPr>
+        <w:t>Figure 17. Fix commits for BUG-006 to BUG-009</w:t>
+      </w:r>
+    </w:p>
+    <w:p>
+      <w:pPr>
+        <w:contextualSpacing/>
+      </w:pPr>
+    </w:p>
+    <w:p>
+      <w:pPr>
+        <w:keepNext/>
+        <w:contextualSpacing/>
+        <w:jc w:val="center"/>
+      </w:pPr>
+      <w:r>
+        <w:rPr>
+          <w:noProof/>
+        </w:rPr>
+        <w:drawing>
+          <wp:inline distT="0" distB="0" distL="0" distR="0">
+            <wp:extent cx="5760720" cy="1059386"/>
+            <wp:effectExtent l="0" t="0" r="0" b="0"/>
+            <wp:docPr id="918" name="Figure 918" descr="Figure 18. BUG-010, logo referenced but not in the repository"/>
+            <wp:cNvGraphicFramePr/>
+            <a:graphic xmlns:a="http://schemas.openxmlformats.org/drawingml/2006/main">
+              <a:graphicData uri="http://schemas.openxmlformats.org/drawingml/2006/picture">
+                <pic:pic xmlns:pic="http://schemas.openxmlformats.org/drawingml/2006/picture">
+                  <pic:nvPicPr>
+                    <pic:cNvPr id="918" name="f18.png"/>
+                    <pic:cNvPicPr/>
+                  </pic:nvPicPr>
+                  <pic:blipFill>
+                    <a:blip r:embed="rId204"/>
+                    <a:stretch>
+                      <a:fillRect/>
+                    </a:stretch>
+                  </pic:blipFill>
+                  <pic:spPr>
+                    <a:xfrm>
+                      <a:off x="0" y="0"/>
+                      <a:ext cx="5760720" cy="1059386"/>
+                    </a:xfrm>
+                    <a:prstGeom prst="rect">
+                      <a:avLst/>
+                    </a:prstGeom>
+                  </pic:spPr>
+                </pic:pic>
+              </a:graphicData>
+            </a:graphic>
+          </wp:inline>
+        </w:drawing>
+      </w:r>
+    </w:p>
+    <w:p>
+      <w:pPr>
+        <w:contextualSpacing/>
+        <w:jc w:val="center"/>
+      </w:pPr>
+      <w:r>
+        <w:rPr>
+          <w:rFonts w:ascii="Times New Roman" w:hAnsi="Times New Roman" w:cs="Times New Roman"/>
+        </w:rPr>
+        <w:t>Figure 18. BUG-010, logo referenced but not in the repository</w:t>
       </w:r>
     </w:p>
     <w:p>

</xml_diff>

<commit_message>
Move required Form 2 evidence under Evidence Attached; drop extra figures
Co-Authored-By: Claude Opus 5.5 <noreply@anthropic.com>
Claude-Session: https://claude.ai/code/session_01QSVomszqQWngwxcj9sBbPY
</commit_message>
<xml_diff>
--- a/docs/week7/LSIAMS_Week7_System_Enhancement_and_Testing.docx
+++ b/docs/week7/LSIAMS_Week7_System_Enhancement_and_Testing.docx
@@ -2802,6 +2802,259 @@
         </w:rPr>
         <w:t>☑ Repository Commit Logs</w:t>
       </w:r>
+    </w:p>
+    <w:p>
+      <w:pPr>
+        <w:contextualSpacing/>
+      </w:pPr>
+    </w:p>
+    <w:p>
+      <w:pPr>
+        <w:keepNext/>
+        <w:contextualSpacing/>
+        <w:jc w:val="center"/>
+      </w:pPr>
+      <w:r>
+        <w:rPr>
+          <w:noProof/>
+        </w:rPr>
+        <w:drawing>
+          <wp:inline distT="0" distB="0" distL="0" distR="0">
+            <wp:extent cx="5760720" cy="1995430"/>
+            <wp:effectExtent l="0" t="0" r="0" b="0"/>
+            <wp:docPr id="930" name="Picture 930" descr="Before-and-After Screenshots: fingerprint overrides on the administrator dashboard"/>
+            <wp:cNvGraphicFramePr/>
+            <a:graphic xmlns:a="http://schemas.openxmlformats.org/drawingml/2006/main">
+              <a:graphicData uri="http://schemas.openxmlformats.org/drawingml/2006/picture">
+                <pic:pic xmlns:pic="http://schemas.openxmlformats.org/drawingml/2006/picture">
+                  <pic:nvPicPr>
+                    <pic:cNvPr id="930" name="override-before-after.png"/>
+                    <pic:cNvPicPr/>
+                  </pic:nvPicPr>
+                  <pic:blipFill>
+                    <a:blip r:embed="rId12"/>
+                    <a:stretch>
+                      <a:fillRect/>
+                    </a:stretch>
+                  </pic:blipFill>
+                  <pic:spPr>
+                    <a:xfrm>
+                      <a:off x="0" y="0"/>
+                      <a:ext cx="5760720" cy="1995430"/>
+                    </a:xfrm>
+                    <a:prstGeom prst="rect">
+                      <a:avLst/>
+                    </a:prstGeom>
+                  </pic:spPr>
+                </pic:pic>
+              </a:graphicData>
+            </a:graphic>
+          </wp:inline>
+        </w:drawing>
+      </w:r>
+    </w:p>
+    <w:p>
+      <w:pPr>
+        <w:contextualSpacing/>
+        <w:jc w:val="center"/>
+      </w:pPr>
+      <w:r>
+        <w:rPr>
+          <w:rFonts w:ascii="Times New Roman" w:hAnsi="Times New Roman" w:cs="Times New Roman"/>
+        </w:rPr>
+        <w:t>Before-and-After Screenshots: fingerprint overrides on the administrator dashboard</w:t>
+      </w:r>
+    </w:p>
+    <w:p>
+      <w:pPr>
+        <w:contextualSpacing/>
+      </w:pPr>
+    </w:p>
+    <w:p>
+      <w:pPr>
+        <w:keepNext/>
+        <w:contextualSpacing/>
+        <w:jc w:val="center"/>
+      </w:pPr>
+      <w:r>
+        <w:rPr>
+          <w:noProof/>
+        </w:rPr>
+        <w:drawing>
+          <wp:inline distT="0" distB="0" distL="0" distR="0">
+            <wp:extent cx="5760720" cy="6698057"/>
+            <wp:effectExtent l="0" t="0" r="0" b="0"/>
+            <wp:docPr id="931" name="Picture 931" descr="Updated Source Code: power-loss enhancement, commit 747be8c"/>
+            <wp:cNvGraphicFramePr/>
+            <a:graphic xmlns:a="http://schemas.openxmlformats.org/drawingml/2006/main">
+              <a:graphicData uri="http://schemas.openxmlformats.org/drawingml/2006/picture">
+                <pic:pic xmlns:pic="http://schemas.openxmlformats.org/drawingml/2006/picture">
+                  <pic:nvPicPr>
+                    <pic:cNvPr id="931" name="power-loss-commit.png"/>
+                    <pic:cNvPicPr/>
+                  </pic:nvPicPr>
+                  <pic:blipFill>
+                    <a:blip r:embed="rId200"/>
+                    <a:stretch>
+                      <a:fillRect/>
+                    </a:stretch>
+                  </pic:blipFill>
+                  <pic:spPr>
+                    <a:xfrm>
+                      <a:off x="0" y="0"/>
+                      <a:ext cx="5760720" cy="6698057"/>
+                    </a:xfrm>
+                    <a:prstGeom prst="rect">
+                      <a:avLst/>
+                    </a:prstGeom>
+                  </pic:spPr>
+                </pic:pic>
+              </a:graphicData>
+            </a:graphic>
+          </wp:inline>
+        </w:drawing>
+      </w:r>
+    </w:p>
+    <w:p>
+      <w:pPr>
+        <w:contextualSpacing/>
+        <w:jc w:val="center"/>
+      </w:pPr>
+      <w:r>
+        <w:rPr>
+          <w:rFonts w:ascii="Times New Roman" w:hAnsi="Times New Roman" w:cs="Times New Roman"/>
+        </w:rPr>
+        <w:t>Updated Source Code: power-loss enhancement, commit 747be8c</w:t>
+      </w:r>
+    </w:p>
+    <w:p>
+      <w:pPr>
+        <w:contextualSpacing/>
+      </w:pPr>
+    </w:p>
+    <w:p>
+      <w:pPr>
+        <w:keepNext/>
+        <w:contextualSpacing/>
+        <w:jc w:val="center"/>
+      </w:pPr>
+      <w:r>
+        <w:rPr>
+          <w:noProof/>
+        </w:rPr>
+        <w:drawing>
+          <wp:inline distT="0" distB="0" distL="0" distR="0">
+            <wp:extent cx="5760720" cy="4862438"/>
+            <wp:effectExtent l="0" t="0" r="0" b="0"/>
+            <wp:docPr id="932" name="Picture 932" descr="Updated Source Code: fingerprint overrides, report filters and LED feedback"/>
+            <wp:cNvGraphicFramePr/>
+            <a:graphic xmlns:a="http://schemas.openxmlformats.org/drawingml/2006/main">
+              <a:graphicData uri="http://schemas.openxmlformats.org/drawingml/2006/picture">
+                <pic:pic xmlns:pic="http://schemas.openxmlformats.org/drawingml/2006/picture">
+                  <pic:nvPicPr>
+                    <pic:cNvPr id="932" name="enhancement-commits.png"/>
+                    <pic:cNvPicPr/>
+                  </pic:nvPicPr>
+                  <pic:blipFill>
+                    <a:blip r:embed="rId201"/>
+                    <a:stretch>
+                      <a:fillRect/>
+                    </a:stretch>
+                  </pic:blipFill>
+                  <pic:spPr>
+                    <a:xfrm>
+                      <a:off x="0" y="0"/>
+                      <a:ext cx="5760720" cy="4862438"/>
+                    </a:xfrm>
+                    <a:prstGeom prst="rect">
+                      <a:avLst/>
+                    </a:prstGeom>
+                  </pic:spPr>
+                </pic:pic>
+              </a:graphicData>
+            </a:graphic>
+          </wp:inline>
+        </w:drawing>
+      </w:r>
+    </w:p>
+    <w:p>
+      <w:pPr>
+        <w:contextualSpacing/>
+        <w:jc w:val="center"/>
+      </w:pPr>
+      <w:r>
+        <w:rPr>
+          <w:rFonts w:ascii="Times New Roman" w:hAnsi="Times New Roman" w:cs="Times New Roman"/>
+        </w:rPr>
+        <w:t>Updated Source Code: fingerprint overrides, report filters and LED feedback</w:t>
+      </w:r>
+    </w:p>
+    <w:p>
+      <w:pPr>
+        <w:contextualSpacing/>
+      </w:pPr>
+    </w:p>
+    <w:p>
+      <w:pPr>
+        <w:keepNext/>
+        <w:contextualSpacing/>
+        <w:jc w:val="center"/>
+      </w:pPr>
+      <w:r>
+        <w:rPr>
+          <w:noProof/>
+        </w:rPr>
+        <w:drawing>
+          <wp:inline distT="0" distB="0" distL="0" distR="0">
+            <wp:extent cx="5760720" cy="2113999"/>
+            <wp:effectExtent l="0" t="0" r="0" b="0"/>
+            <wp:docPr id="933" name="Picture 933" descr="Repository Commit Logs"/>
+            <wp:cNvGraphicFramePr/>
+            <a:graphic xmlns:a="http://schemas.openxmlformats.org/drawingml/2006/main">
+              <a:graphicData uri="http://schemas.openxmlformats.org/drawingml/2006/picture">
+                <pic:pic xmlns:pic="http://schemas.openxmlformats.org/drawingml/2006/picture">
+                  <pic:nvPicPr>
+                    <pic:cNvPr id="933" name="commit-log.png"/>
+                    <pic:cNvPicPr/>
+                  </pic:nvPicPr>
+                  <pic:blipFill>
+                    <a:blip r:embed="rId11"/>
+                    <a:stretch>
+                      <a:fillRect/>
+                    </a:stretch>
+                  </pic:blipFill>
+                  <pic:spPr>
+                    <a:xfrm>
+                      <a:off x="0" y="0"/>
+                      <a:ext cx="5760720" cy="2113999"/>
+                    </a:xfrm>
+                    <a:prstGeom prst="rect">
+                      <a:avLst/>
+                    </a:prstGeom>
+                  </pic:spPr>
+                </pic:pic>
+              </a:graphicData>
+            </a:graphic>
+          </wp:inline>
+        </w:drawing>
+      </w:r>
+    </w:p>
+    <w:p>
+      <w:pPr>
+        <w:contextualSpacing/>
+        <w:jc w:val="center"/>
+      </w:pPr>
+      <w:r>
+        <w:rPr>
+          <w:rFonts w:ascii="Times New Roman" w:hAnsi="Times New Roman" w:cs="Times New Roman"/>
+        </w:rPr>
+        <w:t>Repository Commit Logs</w:t>
+      </w:r>
+    </w:p>
+    <w:p>
+      <w:pPr>
+        <w:contextualSpacing/>
+      </w:pPr>
     </w:p>
     <w:p>
       <w:pPr>
@@ -15166,316 +15419,6 @@
           <w:rFonts w:ascii="Times New Roman" w:hAnsi="Times New Roman" w:cs="Times New Roman"/>
         </w:rPr>
         <w:t>Figure 13. IT-21 RFID tap shown on the teacher dashboard</w:t>
-      </w:r>
-    </w:p>
-    <w:p>
-      <w:pPr>
-        <w:contextualSpacing/>
-      </w:pPr>
-    </w:p>
-    <w:p>
-      <w:pPr>
-        <w:keepNext/>
-        <w:contextualSpacing/>
-        <w:jc w:val="center"/>
-      </w:pPr>
-      <w:r>
-        <w:rPr>
-          <w:noProof/>
-        </w:rPr>
-        <w:drawing>
-          <wp:inline distT="0" distB="0" distL="0" distR="0">
-            <wp:extent cx="5760720" cy="6698057"/>
-            <wp:effectExtent l="0" t="0" r="0" b="0"/>
-            <wp:docPr id="914" name="Figure 914" descr="Figure 14. Power-loss enhancement, commit 747be8c"/>
-            <wp:cNvGraphicFramePr/>
-            <a:graphic xmlns:a="http://schemas.openxmlformats.org/drawingml/2006/main">
-              <a:graphicData uri="http://schemas.openxmlformats.org/drawingml/2006/picture">
-                <pic:pic xmlns:pic="http://schemas.openxmlformats.org/drawingml/2006/picture">
-                  <pic:nvPicPr>
-                    <pic:cNvPr id="914" name="f14.png"/>
-                    <pic:cNvPicPr/>
-                  </pic:nvPicPr>
-                  <pic:blipFill>
-                    <a:blip r:embed="rId200"/>
-                    <a:stretch>
-                      <a:fillRect/>
-                    </a:stretch>
-                  </pic:blipFill>
-                  <pic:spPr>
-                    <a:xfrm>
-                      <a:off x="0" y="0"/>
-                      <a:ext cx="5760720" cy="6698057"/>
-                    </a:xfrm>
-                    <a:prstGeom prst="rect">
-                      <a:avLst/>
-                    </a:prstGeom>
-                  </pic:spPr>
-                </pic:pic>
-              </a:graphicData>
-            </a:graphic>
-          </wp:inline>
-        </w:drawing>
-      </w:r>
-    </w:p>
-    <w:p>
-      <w:pPr>
-        <w:contextualSpacing/>
-        <w:jc w:val="center"/>
-      </w:pPr>
-      <w:r>
-        <w:rPr>
-          <w:rFonts w:ascii="Times New Roman" w:hAnsi="Times New Roman" w:cs="Times New Roman"/>
-        </w:rPr>
-        <w:t>Figure 14. Power-loss enhancement, commit 747be8c</w:t>
-      </w:r>
-    </w:p>
-    <w:p>
-      <w:pPr>
-        <w:contextualSpacing/>
-      </w:pPr>
-    </w:p>
-    <w:p>
-      <w:pPr>
-        <w:keepNext/>
-        <w:contextualSpacing/>
-        <w:jc w:val="center"/>
-      </w:pPr>
-      <w:r>
-        <w:rPr>
-          <w:noProof/>
-        </w:rPr>
-        <w:drawing>
-          <wp:inline distT="0" distB="0" distL="0" distR="0">
-            <wp:extent cx="5760720" cy="4862438"/>
-            <wp:effectExtent l="0" t="0" r="0" b="0"/>
-            <wp:docPr id="915" name="Figure 915" descr="Figure 15. Enhancement commits for fingerprint overrides, report filters and LED feedback"/>
-            <wp:cNvGraphicFramePr/>
-            <a:graphic xmlns:a="http://schemas.openxmlformats.org/drawingml/2006/main">
-              <a:graphicData uri="http://schemas.openxmlformats.org/drawingml/2006/picture">
-                <pic:pic xmlns:pic="http://schemas.openxmlformats.org/drawingml/2006/picture">
-                  <pic:nvPicPr>
-                    <pic:cNvPr id="915" name="f15.png"/>
-                    <pic:cNvPicPr/>
-                  </pic:nvPicPr>
-                  <pic:blipFill>
-                    <a:blip r:embed="rId201"/>
-                    <a:stretch>
-                      <a:fillRect/>
-                    </a:stretch>
-                  </pic:blipFill>
-                  <pic:spPr>
-                    <a:xfrm>
-                      <a:off x="0" y="0"/>
-                      <a:ext cx="5760720" cy="4862438"/>
-                    </a:xfrm>
-                    <a:prstGeom prst="rect">
-                      <a:avLst/>
-                    </a:prstGeom>
-                  </pic:spPr>
-                </pic:pic>
-              </a:graphicData>
-            </a:graphic>
-          </wp:inline>
-        </w:drawing>
-      </w:r>
-    </w:p>
-    <w:p>
-      <w:pPr>
-        <w:contextualSpacing/>
-        <w:jc w:val="center"/>
-      </w:pPr>
-      <w:r>
-        <w:rPr>
-          <w:rFonts w:ascii="Times New Roman" w:hAnsi="Times New Roman" w:cs="Times New Roman"/>
-        </w:rPr>
-        <w:t>Figure 15. Enhancement commits for fingerprint overrides, report filters and LED feedback</w:t>
-      </w:r>
-    </w:p>
-    <w:p>
-      <w:pPr>
-        <w:contextualSpacing/>
-      </w:pPr>
-    </w:p>
-    <w:p>
-      <w:pPr>
-        <w:keepNext/>
-        <w:contextualSpacing/>
-        <w:jc w:val="center"/>
-      </w:pPr>
-      <w:r>
-        <w:rPr>
-          <w:noProof/>
-        </w:rPr>
-        <w:drawing>
-          <wp:inline distT="0" distB="0" distL="0" distR="0">
-            <wp:extent cx="5760720" cy="2284760"/>
-            <wp:effectExtent l="0" t="0" r="0" b="0"/>
-            <wp:docPr id="916" name="Figure 916" descr="Figure 16. Certificate renewal procedure in docs/HTTPS.md"/>
-            <wp:cNvGraphicFramePr/>
-            <a:graphic xmlns:a="http://schemas.openxmlformats.org/drawingml/2006/main">
-              <a:graphicData uri="http://schemas.openxmlformats.org/drawingml/2006/picture">
-                <pic:pic xmlns:pic="http://schemas.openxmlformats.org/drawingml/2006/picture">
-                  <pic:nvPicPr>
-                    <pic:cNvPr id="916" name="f16.png"/>
-                    <pic:cNvPicPr/>
-                  </pic:nvPicPr>
-                  <pic:blipFill>
-                    <a:blip r:embed="rId202"/>
-                    <a:stretch>
-                      <a:fillRect/>
-                    </a:stretch>
-                  </pic:blipFill>
-                  <pic:spPr>
-                    <a:xfrm>
-                      <a:off x="0" y="0"/>
-                      <a:ext cx="5760720" cy="2284760"/>
-                    </a:xfrm>
-                    <a:prstGeom prst="rect">
-                      <a:avLst/>
-                    </a:prstGeom>
-                  </pic:spPr>
-                </pic:pic>
-              </a:graphicData>
-            </a:graphic>
-          </wp:inline>
-        </w:drawing>
-      </w:r>
-    </w:p>
-    <w:p>
-      <w:pPr>
-        <w:contextualSpacing/>
-        <w:jc w:val="center"/>
-      </w:pPr>
-      <w:r>
-        <w:rPr>
-          <w:rFonts w:ascii="Times New Roman" w:hAnsi="Times New Roman" w:cs="Times New Roman"/>
-        </w:rPr>
-        <w:t>Figure 16. Certificate renewal procedure in docs/HTTPS.md</w:t>
-      </w:r>
-    </w:p>
-    <w:p>
-      <w:pPr>
-        <w:contextualSpacing/>
-      </w:pPr>
-    </w:p>
-    <w:p>
-      <w:pPr>
-        <w:keepNext/>
-        <w:contextualSpacing/>
-        <w:jc w:val="center"/>
-      </w:pPr>
-      <w:r>
-        <w:rPr>
-          <w:noProof/>
-        </w:rPr>
-        <w:drawing>
-          <wp:inline distT="0" distB="0" distL="0" distR="0">
-            <wp:extent cx="5760720" cy="3266035"/>
-            <wp:effectExtent l="0" t="0" r="0" b="0"/>
-            <wp:docPr id="917" name="Figure 917" descr="Figure 17. Fix commits for BUG-006 to BUG-009"/>
-            <wp:cNvGraphicFramePr/>
-            <a:graphic xmlns:a="http://schemas.openxmlformats.org/drawingml/2006/main">
-              <a:graphicData uri="http://schemas.openxmlformats.org/drawingml/2006/picture">
-                <pic:pic xmlns:pic="http://schemas.openxmlformats.org/drawingml/2006/picture">
-                  <pic:nvPicPr>
-                    <pic:cNvPr id="917" name="f17.png"/>
-                    <pic:cNvPicPr/>
-                  </pic:nvPicPr>
-                  <pic:blipFill>
-                    <a:blip r:embed="rId203"/>
-                    <a:stretch>
-                      <a:fillRect/>
-                    </a:stretch>
-                  </pic:blipFill>
-                  <pic:spPr>
-                    <a:xfrm>
-                      <a:off x="0" y="0"/>
-                      <a:ext cx="5760720" cy="3266035"/>
-                    </a:xfrm>
-                    <a:prstGeom prst="rect">
-                      <a:avLst/>
-                    </a:prstGeom>
-                  </pic:spPr>
-                </pic:pic>
-              </a:graphicData>
-            </a:graphic>
-          </wp:inline>
-        </w:drawing>
-      </w:r>
-    </w:p>
-    <w:p>
-      <w:pPr>
-        <w:contextualSpacing/>
-        <w:jc w:val="center"/>
-      </w:pPr>
-      <w:r>
-        <w:rPr>
-          <w:rFonts w:ascii="Times New Roman" w:hAnsi="Times New Roman" w:cs="Times New Roman"/>
-        </w:rPr>
-        <w:t>Figure 17. Fix commits for BUG-006 to BUG-009</w:t>
-      </w:r>
-    </w:p>
-    <w:p>
-      <w:pPr>
-        <w:contextualSpacing/>
-      </w:pPr>
-    </w:p>
-    <w:p>
-      <w:pPr>
-        <w:keepNext/>
-        <w:contextualSpacing/>
-        <w:jc w:val="center"/>
-      </w:pPr>
-      <w:r>
-        <w:rPr>
-          <w:noProof/>
-        </w:rPr>
-        <w:drawing>
-          <wp:inline distT="0" distB="0" distL="0" distR="0">
-            <wp:extent cx="5760720" cy="1059386"/>
-            <wp:effectExtent l="0" t="0" r="0" b="0"/>
-            <wp:docPr id="918" name="Figure 918" descr="Figure 18. BUG-010, logo referenced but not in the repository"/>
-            <wp:cNvGraphicFramePr/>
-            <a:graphic xmlns:a="http://schemas.openxmlformats.org/drawingml/2006/main">
-              <a:graphicData uri="http://schemas.openxmlformats.org/drawingml/2006/picture">
-                <pic:pic xmlns:pic="http://schemas.openxmlformats.org/drawingml/2006/picture">
-                  <pic:nvPicPr>
-                    <pic:cNvPr id="918" name="f18.png"/>
-                    <pic:cNvPicPr/>
-                  </pic:nvPicPr>
-                  <pic:blipFill>
-                    <a:blip r:embed="rId204"/>
-                    <a:stretch>
-                      <a:fillRect/>
-                    </a:stretch>
-                  </pic:blipFill>
-                  <pic:spPr>
-                    <a:xfrm>
-                      <a:off x="0" y="0"/>
-                      <a:ext cx="5760720" cy="1059386"/>
-                    </a:xfrm>
-                    <a:prstGeom prst="rect">
-                      <a:avLst/>
-                    </a:prstGeom>
-                  </pic:spPr>
-                </pic:pic>
-              </a:graphicData>
-            </a:graphic>
-          </wp:inline>
-        </w:drawing>
-      </w:r>
-    </w:p>
-    <w:p>
-      <w:pPr>
-        <w:contextualSpacing/>
-        <w:jc w:val="center"/>
-      </w:pPr>
-      <w:r>
-        <w:rPr>
-          <w:rFonts w:ascii="Times New Roman" w:hAnsi="Times New Roman" w:cs="Times New Roman"/>
-        </w:rPr>
-        <w:t>Figure 18. BUG-010, logo referenced but not in the repository</w:t>
       </w:r>
     </w:p>
     <w:p>

</xml_diff>